<commit_message>
feat: add simulation page and supporting features for wireguard protocol replay
</commit_message>
<xml_diff>
--- a/docs/NexLink-Project-Report.docx
+++ b/docs/NexLink-Project-Report.docx
@@ -257,7 +257,7 @@
                 <w:sz w:val="19"/>
                 <w:szCs w:val="19"/>
               </w:rPr>
-              <w:t>18 October 2026</w:t>
+              <w:t>19 October 2026</w:t>
             </w:r>
           </w:p>
         </w:tc>
@@ -431,7 +431,7 @@
                 <w:sz w:val="19"/>
                 <w:szCs w:val="19"/>
               </w:rPr>
-              <w:t>Results of test runs and live checks performed on 16–18 October 2026. Nothing is reported as done unless it was tested.</w:t>
+              <w:t>Results of test runs and live checks performed on 16–19 October 2026. Nothing is reported as done unless it was tested.</w:t>
             </w:r>
           </w:p>
         </w:tc>
@@ -463,7 +463,7 @@
     <w:sdt>
       <w:sdtPr>
         <w:alias w:val="Contents"/>
-        <w:id w:val="476887014"/>
+        <w:id w:val="-292838268"/>
       </w:sdtPr>
       <w:sdtEndPr/>
       <w:sdtContent>
@@ -486,7 +486,7 @@
           <w:r>
             <w:fldChar w:fldCharType="separate"/>
           </w:r>
-          <w:hyperlink w:anchor="_Toc243225922" w:history="1">
+          <w:hyperlink w:anchor="_Toc243468824" w:history="1">
             <w:r>
               <w:rPr>
                 <w:rStyle w:val="Hyperlink"/>
@@ -510,7 +510,7 @@
               <w:rPr>
                 <w:noProof/>
               </w:rPr>
-              <w:instrText xml:space="preserve"> PAGEREF _Toc243225922 \h </w:instrText>
+              <w:instrText xml:space="preserve"> PAGEREF _Toc243468824 \h </w:instrText>
             </w:r>
             <w:r>
               <w:rPr>
@@ -547,7 +547,7 @@
               <w:noProof/>
             </w:rPr>
           </w:pPr>
-          <w:hyperlink w:anchor="_Toc243225923" w:history="1">
+          <w:hyperlink w:anchor="_Toc243468825" w:history="1">
             <w:r>
               <w:rPr>
                 <w:rStyle w:val="Hyperlink"/>
@@ -571,7 +571,7 @@
               <w:rPr>
                 <w:noProof/>
               </w:rPr>
-              <w:instrText xml:space="preserve"> PAGEREF _Toc243225923 \h </w:instrText>
+              <w:instrText xml:space="preserve"> PAGEREF _Toc243468825 \h </w:instrText>
             </w:r>
             <w:r>
               <w:rPr>
@@ -608,7 +608,7 @@
               <w:noProof/>
             </w:rPr>
           </w:pPr>
-          <w:hyperlink w:anchor="_Toc243225924" w:history="1">
+          <w:hyperlink w:anchor="_Toc243468826" w:history="1">
             <w:r>
               <w:rPr>
                 <w:rStyle w:val="Hyperlink"/>
@@ -632,7 +632,7 @@
               <w:rPr>
                 <w:noProof/>
               </w:rPr>
-              <w:instrText xml:space="preserve"> PAGEREF _Toc243225924 \h </w:instrText>
+              <w:instrText xml:space="preserve"> PAGEREF _Toc243468826 \h </w:instrText>
             </w:r>
             <w:r>
               <w:rPr>
@@ -669,7 +669,7 @@
               <w:noProof/>
             </w:rPr>
           </w:pPr>
-          <w:hyperlink w:anchor="_Toc243225925" w:history="1">
+          <w:hyperlink w:anchor="_Toc243468827" w:history="1">
             <w:r>
               <w:rPr>
                 <w:rStyle w:val="Hyperlink"/>
@@ -693,7 +693,7 @@
               <w:rPr>
                 <w:noProof/>
               </w:rPr>
-              <w:instrText xml:space="preserve"> PAGEREF _Toc243225925 \h </w:instrText>
+              <w:instrText xml:space="preserve"> PAGEREF _Toc243468827 \h </w:instrText>
             </w:r>
             <w:r>
               <w:rPr>
@@ -730,7 +730,7 @@
               <w:noProof/>
             </w:rPr>
           </w:pPr>
-          <w:hyperlink w:anchor="_Toc243225926" w:history="1">
+          <w:hyperlink w:anchor="_Toc243468828" w:history="1">
             <w:r>
               <w:rPr>
                 <w:rStyle w:val="Hyperlink"/>
@@ -754,7 +754,7 @@
               <w:rPr>
                 <w:noProof/>
               </w:rPr>
-              <w:instrText xml:space="preserve"> PAGEREF _Toc243225926 \h </w:instrText>
+              <w:instrText xml:space="preserve"> PAGEREF _Toc243468828 \h </w:instrText>
             </w:r>
             <w:r>
               <w:rPr>
@@ -791,7 +791,7 @@
               <w:noProof/>
             </w:rPr>
           </w:pPr>
-          <w:hyperlink w:anchor="_Toc243225927" w:history="1">
+          <w:hyperlink w:anchor="_Toc243468829" w:history="1">
             <w:r>
               <w:rPr>
                 <w:rStyle w:val="Hyperlink"/>
@@ -815,7 +815,7 @@
               <w:rPr>
                 <w:noProof/>
               </w:rPr>
-              <w:instrText xml:space="preserve"> PAGEREF _Toc243225927 \h </w:instrText>
+              <w:instrText xml:space="preserve"> PAGEREF _Toc243468829 \h </w:instrText>
             </w:r>
             <w:r>
               <w:rPr>
@@ -852,7 +852,7 @@
               <w:noProof/>
             </w:rPr>
           </w:pPr>
-          <w:hyperlink w:anchor="_Toc243225928" w:history="1">
+          <w:hyperlink w:anchor="_Toc243468830" w:history="1">
             <w:r>
               <w:rPr>
                 <w:rStyle w:val="Hyperlink"/>
@@ -876,7 +876,7 @@
               <w:rPr>
                 <w:noProof/>
               </w:rPr>
-              <w:instrText xml:space="preserve"> PAGEREF _Toc243225928 \h </w:instrText>
+              <w:instrText xml:space="preserve"> PAGEREF _Toc243468830 \h </w:instrText>
             </w:r>
             <w:r>
               <w:rPr>
@@ -913,7 +913,7 @@
               <w:noProof/>
             </w:rPr>
           </w:pPr>
-          <w:hyperlink w:anchor="_Toc243225929" w:history="1">
+          <w:hyperlink w:anchor="_Toc243468831" w:history="1">
             <w:r>
               <w:rPr>
                 <w:rStyle w:val="Hyperlink"/>
@@ -937,7 +937,7 @@
               <w:rPr>
                 <w:noProof/>
               </w:rPr>
-              <w:instrText xml:space="preserve"> PAGEREF _Toc243225929 \h </w:instrText>
+              <w:instrText xml:space="preserve"> PAGEREF _Toc243468831 \h </w:instrText>
             </w:r>
             <w:r>
               <w:rPr>
@@ -974,7 +974,7 @@
               <w:noProof/>
             </w:rPr>
           </w:pPr>
-          <w:hyperlink w:anchor="_Toc243225930" w:history="1">
+          <w:hyperlink w:anchor="_Toc243468832" w:history="1">
             <w:r>
               <w:rPr>
                 <w:rStyle w:val="Hyperlink"/>
@@ -998,7 +998,7 @@
               <w:rPr>
                 <w:noProof/>
               </w:rPr>
-              <w:instrText xml:space="preserve"> PAGEREF _Toc243225930 \h </w:instrText>
+              <w:instrText xml:space="preserve"> PAGEREF _Toc243468832 \h </w:instrText>
             </w:r>
             <w:r>
               <w:rPr>
@@ -1035,7 +1035,7 @@
               <w:noProof/>
             </w:rPr>
           </w:pPr>
-          <w:hyperlink w:anchor="_Toc243225931" w:history="1">
+          <w:hyperlink w:anchor="_Toc243468833" w:history="1">
             <w:r>
               <w:rPr>
                 <w:rStyle w:val="Hyperlink"/>
@@ -1059,7 +1059,7 @@
               <w:rPr>
                 <w:noProof/>
               </w:rPr>
-              <w:instrText xml:space="preserve"> PAGEREF _Toc243225931 \h </w:instrText>
+              <w:instrText xml:space="preserve"> PAGEREF _Toc243468833 \h </w:instrText>
             </w:r>
             <w:r>
               <w:rPr>
@@ -1096,7 +1096,7 @@
               <w:noProof/>
             </w:rPr>
           </w:pPr>
-          <w:hyperlink w:anchor="_Toc243225932" w:history="1">
+          <w:hyperlink w:anchor="_Toc243468834" w:history="1">
             <w:r>
               <w:rPr>
                 <w:rStyle w:val="Hyperlink"/>
@@ -1120,7 +1120,7 @@
               <w:rPr>
                 <w:noProof/>
               </w:rPr>
-              <w:instrText xml:space="preserve"> PAGEREF _Toc243225932 \h </w:instrText>
+              <w:instrText xml:space="preserve"> PAGEREF _Toc243468834 \h </w:instrText>
             </w:r>
             <w:r>
               <w:rPr>
@@ -1157,7 +1157,7 @@
               <w:noProof/>
             </w:rPr>
           </w:pPr>
-          <w:hyperlink w:anchor="_Toc243225933" w:history="1">
+          <w:hyperlink w:anchor="_Toc243468835" w:history="1">
             <w:r>
               <w:rPr>
                 <w:rStyle w:val="Hyperlink"/>
@@ -1181,7 +1181,7 @@
               <w:rPr>
                 <w:noProof/>
               </w:rPr>
-              <w:instrText xml:space="preserve"> PAGEREF _Toc243225933 \h </w:instrText>
+              <w:instrText xml:space="preserve"> PAGEREF _Toc243468835 \h </w:instrText>
             </w:r>
             <w:r>
               <w:rPr>
@@ -1218,7 +1218,7 @@
               <w:noProof/>
             </w:rPr>
           </w:pPr>
-          <w:hyperlink w:anchor="_Toc243225934" w:history="1">
+          <w:hyperlink w:anchor="_Toc243468836" w:history="1">
             <w:r>
               <w:rPr>
                 <w:rStyle w:val="Hyperlink"/>
@@ -1242,7 +1242,7 @@
               <w:rPr>
                 <w:noProof/>
               </w:rPr>
-              <w:instrText xml:space="preserve"> PAGEREF _Toc243225934 \h </w:instrText>
+              <w:instrText xml:space="preserve"> PAGEREF _Toc243468836 \h </w:instrText>
             </w:r>
             <w:r>
               <w:rPr>
@@ -1279,7 +1279,7 @@
               <w:noProof/>
             </w:rPr>
           </w:pPr>
-          <w:hyperlink w:anchor="_Toc243225935" w:history="1">
+          <w:hyperlink w:anchor="_Toc243468837" w:history="1">
             <w:r>
               <w:rPr>
                 <w:rStyle w:val="Hyperlink"/>
@@ -1303,7 +1303,7 @@
               <w:rPr>
                 <w:noProof/>
               </w:rPr>
-              <w:instrText xml:space="preserve"> PAGEREF _Toc243225935 \h </w:instrText>
+              <w:instrText xml:space="preserve"> PAGEREF _Toc243468837 \h </w:instrText>
             </w:r>
             <w:r>
               <w:rPr>
@@ -1340,7 +1340,7 @@
               <w:noProof/>
             </w:rPr>
           </w:pPr>
-          <w:hyperlink w:anchor="_Toc243225936" w:history="1">
+          <w:hyperlink w:anchor="_Toc243468838" w:history="1">
             <w:r>
               <w:rPr>
                 <w:rStyle w:val="Hyperlink"/>
@@ -1364,7 +1364,7 @@
               <w:rPr>
                 <w:noProof/>
               </w:rPr>
-              <w:instrText xml:space="preserve"> PAGEREF _Toc243225936 \h </w:instrText>
+              <w:instrText xml:space="preserve"> PAGEREF _Toc243468838 \h </w:instrText>
             </w:r>
             <w:r>
               <w:rPr>
@@ -1401,7 +1401,7 @@
               <w:noProof/>
             </w:rPr>
           </w:pPr>
-          <w:hyperlink w:anchor="_Toc243225937" w:history="1">
+          <w:hyperlink w:anchor="_Toc243468839" w:history="1">
             <w:r>
               <w:rPr>
                 <w:rStyle w:val="Hyperlink"/>
@@ -1425,7 +1425,7 @@
               <w:rPr>
                 <w:noProof/>
               </w:rPr>
-              <w:instrText xml:space="preserve"> PAGEREF _Toc243225937 \h </w:instrText>
+              <w:instrText xml:space="preserve"> PAGEREF _Toc243468839 \h </w:instrText>
             </w:r>
             <w:r>
               <w:rPr>
@@ -1442,7 +1442,7 @@
               <w:rPr>
                 <w:noProof/>
               </w:rPr>
-              <w:t>9</w:t>
+              <w:t>10</w:t>
             </w:r>
             <w:r>
               <w:rPr>
@@ -1462,7 +1462,7 @@
               <w:noProof/>
             </w:rPr>
           </w:pPr>
-          <w:hyperlink w:anchor="_Toc243225938" w:history="1">
+          <w:hyperlink w:anchor="_Toc243468840" w:history="1">
             <w:r>
               <w:rPr>
                 <w:rStyle w:val="Hyperlink"/>
@@ -1486,7 +1486,7 @@
               <w:rPr>
                 <w:noProof/>
               </w:rPr>
-              <w:instrText xml:space="preserve"> PAGEREF _Toc243225938 \h </w:instrText>
+              <w:instrText xml:space="preserve"> PAGEREF _Toc243468840 \h </w:instrText>
             </w:r>
             <w:r>
               <w:rPr>
@@ -1523,7 +1523,7 @@
               <w:noProof/>
             </w:rPr>
           </w:pPr>
-          <w:hyperlink w:anchor="_Toc243225939" w:history="1">
+          <w:hyperlink w:anchor="_Toc243468841" w:history="1">
             <w:r>
               <w:rPr>
                 <w:rStyle w:val="Hyperlink"/>
@@ -1547,7 +1547,7 @@
               <w:rPr>
                 <w:noProof/>
               </w:rPr>
-              <w:instrText xml:space="preserve"> PAGEREF _Toc243225939 \h </w:instrText>
+              <w:instrText xml:space="preserve"> PAGEREF _Toc243468841 \h </w:instrText>
             </w:r>
             <w:r>
               <w:rPr>
@@ -1584,7 +1584,7 @@
               <w:noProof/>
             </w:rPr>
           </w:pPr>
-          <w:hyperlink w:anchor="_Toc243225940" w:history="1">
+          <w:hyperlink w:anchor="_Toc243468842" w:history="1">
             <w:r>
               <w:rPr>
                 <w:rStyle w:val="Hyperlink"/>
@@ -1608,7 +1608,7 @@
               <w:rPr>
                 <w:noProof/>
               </w:rPr>
-              <w:instrText xml:space="preserve"> PAGEREF _Toc243225940 \h </w:instrText>
+              <w:instrText xml:space="preserve"> PAGEREF _Toc243468842 \h </w:instrText>
             </w:r>
             <w:r>
               <w:rPr>
@@ -1645,7 +1645,7 @@
               <w:noProof/>
             </w:rPr>
           </w:pPr>
-          <w:hyperlink w:anchor="_Toc243225941" w:history="1">
+          <w:hyperlink w:anchor="_Toc243468843" w:history="1">
             <w:r>
               <w:rPr>
                 <w:rStyle w:val="Hyperlink"/>
@@ -1669,7 +1669,7 @@
               <w:rPr>
                 <w:noProof/>
               </w:rPr>
-              <w:instrText xml:space="preserve"> PAGEREF _Toc243225941 \h </w:instrText>
+              <w:instrText xml:space="preserve"> PAGEREF _Toc243468843 \h </w:instrText>
             </w:r>
             <w:r>
               <w:rPr>
@@ -1706,7 +1706,7 @@
               <w:noProof/>
             </w:rPr>
           </w:pPr>
-          <w:hyperlink w:anchor="_Toc243225942" w:history="1">
+          <w:hyperlink w:anchor="_Toc243468844" w:history="1">
             <w:r>
               <w:rPr>
                 <w:rStyle w:val="Hyperlink"/>
@@ -1730,7 +1730,7 @@
               <w:rPr>
                 <w:noProof/>
               </w:rPr>
-              <w:instrText xml:space="preserve"> PAGEREF _Toc243225942 \h </w:instrText>
+              <w:instrText xml:space="preserve"> PAGEREF _Toc243468844 \h </w:instrText>
             </w:r>
             <w:r>
               <w:rPr>
@@ -1767,7 +1767,7 @@
               <w:noProof/>
             </w:rPr>
           </w:pPr>
-          <w:hyperlink w:anchor="_Toc243225943" w:history="1">
+          <w:hyperlink w:anchor="_Toc243468845" w:history="1">
             <w:r>
               <w:rPr>
                 <w:rStyle w:val="Hyperlink"/>
@@ -1791,7 +1791,7 @@
               <w:rPr>
                 <w:noProof/>
               </w:rPr>
-              <w:instrText xml:space="preserve"> PAGEREF _Toc243225943 \h </w:instrText>
+              <w:instrText xml:space="preserve"> PAGEREF _Toc243468845 \h </w:instrText>
             </w:r>
             <w:r>
               <w:rPr>
@@ -1828,7 +1828,7 @@
               <w:noProof/>
             </w:rPr>
           </w:pPr>
-          <w:hyperlink w:anchor="_Toc243225944" w:history="1">
+          <w:hyperlink w:anchor="_Toc243468846" w:history="1">
             <w:r>
               <w:rPr>
                 <w:rStyle w:val="Hyperlink"/>
@@ -1852,7 +1852,7 @@
               <w:rPr>
                 <w:noProof/>
               </w:rPr>
-              <w:instrText xml:space="preserve"> PAGEREF _Toc243225944 \h </w:instrText>
+              <w:instrText xml:space="preserve"> PAGEREF _Toc243468846 \h </w:instrText>
             </w:r>
             <w:r>
               <w:rPr>
@@ -1889,7 +1889,7 @@
               <w:noProof/>
             </w:rPr>
           </w:pPr>
-          <w:hyperlink w:anchor="_Toc243225945" w:history="1">
+          <w:hyperlink w:anchor="_Toc243468847" w:history="1">
             <w:r>
               <w:rPr>
                 <w:rStyle w:val="Hyperlink"/>
@@ -1913,7 +1913,7 @@
               <w:rPr>
                 <w:noProof/>
               </w:rPr>
-              <w:instrText xml:space="preserve"> PAGEREF _Toc243225945 \h </w:instrText>
+              <w:instrText xml:space="preserve"> PAGEREF _Toc243468847 \h </w:instrText>
             </w:r>
             <w:r>
               <w:rPr>
@@ -1950,7 +1950,7 @@
               <w:noProof/>
             </w:rPr>
           </w:pPr>
-          <w:hyperlink w:anchor="_Toc243225946" w:history="1">
+          <w:hyperlink w:anchor="_Toc243468848" w:history="1">
             <w:r>
               <w:rPr>
                 <w:rStyle w:val="Hyperlink"/>
@@ -1974,7 +1974,7 @@
               <w:rPr>
                 <w:noProof/>
               </w:rPr>
-              <w:instrText xml:space="preserve"> PAGEREF _Toc243225946 \h </w:instrText>
+              <w:instrText xml:space="preserve"> PAGEREF _Toc243468848 \h </w:instrText>
             </w:r>
             <w:r>
               <w:rPr>
@@ -2011,7 +2011,7 @@
               <w:noProof/>
             </w:rPr>
           </w:pPr>
-          <w:hyperlink w:anchor="_Toc243225947" w:history="1">
+          <w:hyperlink w:anchor="_Toc243468849" w:history="1">
             <w:r>
               <w:rPr>
                 <w:rStyle w:val="Hyperlink"/>
@@ -2035,7 +2035,7 @@
               <w:rPr>
                 <w:noProof/>
               </w:rPr>
-              <w:instrText xml:space="preserve"> PAGEREF _Toc243225947 \h </w:instrText>
+              <w:instrText xml:space="preserve"> PAGEREF _Toc243468849 \h </w:instrText>
             </w:r>
             <w:r>
               <w:rPr>
@@ -2072,7 +2072,7 @@
               <w:noProof/>
             </w:rPr>
           </w:pPr>
-          <w:hyperlink w:anchor="_Toc243225948" w:history="1">
+          <w:hyperlink w:anchor="_Toc243468850" w:history="1">
             <w:r>
               <w:rPr>
                 <w:rStyle w:val="Hyperlink"/>
@@ -2096,7 +2096,7 @@
               <w:rPr>
                 <w:noProof/>
               </w:rPr>
-              <w:instrText xml:space="preserve"> PAGEREF _Toc243225948 \h </w:instrText>
+              <w:instrText xml:space="preserve"> PAGEREF _Toc243468850 \h </w:instrText>
             </w:r>
             <w:r>
               <w:rPr>
@@ -2133,7 +2133,7 @@
               <w:noProof/>
             </w:rPr>
           </w:pPr>
-          <w:hyperlink w:anchor="_Toc243225949" w:history="1">
+          <w:hyperlink w:anchor="_Toc243468851" w:history="1">
             <w:r>
               <w:rPr>
                 <w:rStyle w:val="Hyperlink"/>
@@ -2157,7 +2157,7 @@
               <w:rPr>
                 <w:noProof/>
               </w:rPr>
-              <w:instrText xml:space="preserve"> PAGEREF _Toc243225949 \h </w:instrText>
+              <w:instrText xml:space="preserve"> PAGEREF _Toc243468851 \h </w:instrText>
             </w:r>
             <w:r>
               <w:rPr>
@@ -2194,7 +2194,7 @@
               <w:noProof/>
             </w:rPr>
           </w:pPr>
-          <w:hyperlink w:anchor="_Toc243225950" w:history="1">
+          <w:hyperlink w:anchor="_Toc243468852" w:history="1">
             <w:r>
               <w:rPr>
                 <w:rStyle w:val="Hyperlink"/>
@@ -2218,7 +2218,7 @@
               <w:rPr>
                 <w:noProof/>
               </w:rPr>
-              <w:instrText xml:space="preserve"> PAGEREF _Toc243225950 \h </w:instrText>
+              <w:instrText xml:space="preserve"> PAGEREF _Toc243468852 \h </w:instrText>
             </w:r>
             <w:r>
               <w:rPr>
@@ -2257,7 +2257,7 @@
         <w:pStyle w:val="Heading1"/>
         <w:pageBreakBefore/>
       </w:pPr>
-      <w:bookmarkStart w:id="0" w:name="_Toc243225922"/>
+      <w:bookmarkStart w:id="0" w:name="_Toc243468824"/>
       <w:r>
         <w:t>1. Executive summary</w:t>
       </w:r>
@@ -2276,14 +2276,17 @@
         <w:spacing w:after="120" w:line="276" w:lineRule="auto"/>
       </w:pPr>
       <w:r>
-        <w:t>Since the last update the remaining networking step has been advanced: a real WireGuard tunnel between two enrolled agents now runs end to end on one machine (nexlink-agent lab). The console showed the link as connected and direct, and an approved connectivity test executed by the agent through the encrypted tunnel was verified at 0.23 ms RTT with 0% packet loss. The test that still needs a second physical PC is documented step by step.</w:t>
+        <w:t>A real WireGuard tunnel between two enrolled agents runs end to end: first on one machine (nexlink-agent lab), then between two separate agent processes over the PC’s LAN address with the new run --userspace mode, which carries the tunnel inside the agent — no WireGuard app and no Administrator rights. The console showed the link as connected and direct, and an approved connectivity test executed by the agent through the encrypted tunnel was verified at 0.23 ms RTT with 0% packet loss. The portal can now be</w:t>
+      </w:r>
+      <w:r>
+        <w:t xml:space="preserve"> opened from a second PC on the same Wi-Fi, which downloads the agent and enrolls itself from the browser. The agent streams its own output to a live console on the device page, can run as a Windows service, and live Groq diagnosis has been run against real evidence.</w:t>
       </w:r>
     </w:p>
     <w:p>
       <w:pPr>
         <w:pStyle w:val="Heading2"/>
       </w:pPr>
-      <w:bookmarkStart w:id="1" w:name="_Toc243225923"/>
+      <w:bookmarkStart w:id="1" w:name="_Toc243468825"/>
       <w:r>
         <w:t>Key numbers</w:t>
       </w:r>
@@ -2458,7 +2461,7 @@
                 <w:sz w:val="19"/>
                 <w:szCs w:val="19"/>
               </w:rPr>
-              <w:t>94 / 94</w:t>
+              <w:t>102 / 102</w:t>
             </w:r>
           </w:p>
         </w:tc>
@@ -2485,7 +2488,7 @@
                 <w:sz w:val="19"/>
                 <w:szCs w:val="19"/>
               </w:rPr>
-              <w:t>Control plane 59, Go agent 20, diagnostic service 15</w:t>
+              <w:t>Control plane 64, Go agent 23, diagnostic service 15</w:t>
             </w:r>
           </w:p>
         </w:tc>
@@ -2690,7 +2693,7 @@
                 <w:sz w:val="19"/>
                 <w:szCs w:val="19"/>
               </w:rPr>
-              <w:t>Approved connectivity test through the tunnel</w:t>
+              <w:t>Tunnel between two agent processes over the LAN address</w:t>
             </w:r>
           </w:p>
         </w:tc>
@@ -2718,7 +2721,7 @@
                 <w:sz w:val="19"/>
                 <w:szCs w:val="19"/>
               </w:rPr>
-              <w:t>Successful</w:t>
+              <w:t>Verified</w:t>
             </w:r>
           </w:p>
         </w:tc>
@@ -2746,7 +2749,7 @@
                 <w:sz w:val="19"/>
                 <w:szCs w:val="19"/>
               </w:rPr>
-              <w:t>RTT 0.23 ms, jitter 0.31 ms, loss 0%, 3/3 measurements valid</w:t>
+              <w:t>run --userspace on UDP 51820 / 51821; probes 0.3–2.9 ms both ways; topology connected · direct</w:t>
             </w:r>
           </w:p>
         </w:tc>
@@ -2777,7 +2780,7 @@
                 <w:sz w:val="19"/>
                 <w:szCs w:val="19"/>
               </w:rPr>
-              <w:t>Console production build</w:t>
+              <w:t>Approved connectivity test through the tunnel</w:t>
             </w:r>
           </w:p>
         </w:tc>
@@ -2804,7 +2807,7 @@
                 <w:sz w:val="19"/>
                 <w:szCs w:val="19"/>
               </w:rPr>
-              <w:t>Passed</w:t>
+              <w:t>Successful</w:t>
             </w:r>
           </w:p>
         </w:tc>
@@ -2831,7 +2834,7 @@
                 <w:sz w:val="19"/>
                 <w:szCs w:val="19"/>
               </w:rPr>
-              <w:t>12 routes, Next.js 15</w:t>
+              <w:t>RTT 0.23 ms, jitter 0.31 ms, loss 0%, 3/3 measurements valid</w:t>
             </w:r>
           </w:p>
         </w:tc>
@@ -2863,6 +2866,179 @@
                 <w:sz w:val="19"/>
                 <w:szCs w:val="19"/>
               </w:rPr>
+              <w:t>Live Groq diagnosis</w:t>
+            </w:r>
+          </w:p>
+        </w:tc>
+        <w:tc>
+          <w:tcPr>
+            <w:tcW w:w="2200" w:type="dxa"/>
+            <w:tcBorders>
+              <w:top w:val="single" w:sz="4" w:space="0" w:color="BFBFBF"/>
+              <w:left w:val="single" w:sz="4" w:space="0" w:color="BFBFBF"/>
+              <w:bottom w:val="single" w:sz="4" w:space="0" w:color="BFBFBF"/>
+              <w:right w:val="single" w:sz="4" w:space="0" w:color="BFBFBF"/>
+            </w:tcBorders>
+            <w:shd w:val="clear" w:color="auto" w:fill="FAFAFA"/>
+            <w:tcMar>
+              <w:top w:w="70" w:type="dxa"/>
+              <w:left w:w="110" w:type="dxa"/>
+              <w:bottom w:w="70" w:type="dxa"/>
+              <w:right w:w="110" w:type="dxa"/>
+            </w:tcMar>
+            <w:vAlign w:val="center"/>
+          </w:tcPr>
+          <w:p>
+            <w:r>
+              <w:rPr>
+                <w:sz w:val="19"/>
+                <w:szCs w:val="19"/>
+              </w:rPr>
+              <w:t>Verified</w:t>
+            </w:r>
+          </w:p>
+        </w:tc>
+        <w:tc>
+          <w:tcPr>
+            <w:tcW w:w="3138" w:type="dxa"/>
+            <w:tcBorders>
+              <w:top w:val="single" w:sz="4" w:space="0" w:color="BFBFBF"/>
+              <w:left w:val="single" w:sz="4" w:space="0" w:color="BFBFBF"/>
+              <w:bottom w:val="single" w:sz="4" w:space="0" w:color="BFBFBF"/>
+              <w:right w:val="single" w:sz="4" w:space="0" w:color="BFBFBF"/>
+            </w:tcBorders>
+            <w:shd w:val="clear" w:color="auto" w:fill="FAFAFA"/>
+            <w:tcMar>
+              <w:top w:w="70" w:type="dxa"/>
+              <w:left w:w="110" w:type="dxa"/>
+              <w:bottom w:w="70" w:type="dxa"/>
+              <w:right w:w="110" w:type="dxa"/>
+            </w:tcMar>
+            <w:vAlign w:val="center"/>
+          </w:tcPr>
+          <w:p>
+            <w:r>
+              <w:rPr>
+                <w:sz w:val="19"/>
+                <w:szCs w:val="19"/>
+              </w:rPr>
+              <w:t>openai/gpt-oss-120b, JSON mode, passed schema and evidence-grounding validation</w:t>
+            </w:r>
+          </w:p>
+        </w:tc>
+      </w:tr>
+      <w:tr>
+        <w:tc>
+          <w:tcPr>
+            <w:tcW w:w="4300" w:type="dxa"/>
+            <w:tcBorders>
+              <w:top w:val="single" w:sz="4" w:space="0" w:color="BFBFBF"/>
+              <w:left w:val="single" w:sz="4" w:space="0" w:color="BFBFBF"/>
+              <w:bottom w:val="single" w:sz="4" w:space="0" w:color="BFBFBF"/>
+              <w:right w:val="single" w:sz="4" w:space="0" w:color="BFBFBF"/>
+            </w:tcBorders>
+            <w:tcMar>
+              <w:top w:w="70" w:type="dxa"/>
+              <w:left w:w="110" w:type="dxa"/>
+              <w:bottom w:w="70" w:type="dxa"/>
+              <w:right w:w="110" w:type="dxa"/>
+            </w:tcMar>
+            <w:vAlign w:val="center"/>
+          </w:tcPr>
+          <w:p>
+            <w:r>
+              <w:rPr>
+                <w:b/>
+                <w:bCs/>
+                <w:sz w:val="19"/>
+                <w:szCs w:val="19"/>
+              </w:rPr>
+              <w:t>Console production build</w:t>
+            </w:r>
+          </w:p>
+        </w:tc>
+        <w:tc>
+          <w:tcPr>
+            <w:tcW w:w="2200" w:type="dxa"/>
+            <w:tcBorders>
+              <w:top w:val="single" w:sz="4" w:space="0" w:color="BFBFBF"/>
+              <w:left w:val="single" w:sz="4" w:space="0" w:color="BFBFBF"/>
+              <w:bottom w:val="single" w:sz="4" w:space="0" w:color="BFBFBF"/>
+              <w:right w:val="single" w:sz="4" w:space="0" w:color="BFBFBF"/>
+            </w:tcBorders>
+            <w:tcMar>
+              <w:top w:w="70" w:type="dxa"/>
+              <w:left w:w="110" w:type="dxa"/>
+              <w:bottom w:w="70" w:type="dxa"/>
+              <w:right w:w="110" w:type="dxa"/>
+            </w:tcMar>
+            <w:vAlign w:val="center"/>
+          </w:tcPr>
+          <w:p>
+            <w:r>
+              <w:rPr>
+                <w:sz w:val="19"/>
+                <w:szCs w:val="19"/>
+              </w:rPr>
+              <w:t>Passed</w:t>
+            </w:r>
+          </w:p>
+        </w:tc>
+        <w:tc>
+          <w:tcPr>
+            <w:tcW w:w="3138" w:type="dxa"/>
+            <w:tcBorders>
+              <w:top w:val="single" w:sz="4" w:space="0" w:color="BFBFBF"/>
+              <w:left w:val="single" w:sz="4" w:space="0" w:color="BFBFBF"/>
+              <w:bottom w:val="single" w:sz="4" w:space="0" w:color="BFBFBF"/>
+              <w:right w:val="single" w:sz="4" w:space="0" w:color="BFBFBF"/>
+            </w:tcBorders>
+            <w:tcMar>
+              <w:top w:w="70" w:type="dxa"/>
+              <w:left w:w="110" w:type="dxa"/>
+              <w:bottom w:w="70" w:type="dxa"/>
+              <w:right w:w="110" w:type="dxa"/>
+            </w:tcMar>
+            <w:vAlign w:val="center"/>
+          </w:tcPr>
+          <w:p>
+            <w:r>
+              <w:rPr>
+                <w:sz w:val="19"/>
+                <w:szCs w:val="19"/>
+              </w:rPr>
+              <w:t>12 routes, Next.js 15</w:t>
+            </w:r>
+          </w:p>
+        </w:tc>
+      </w:tr>
+      <w:tr>
+        <w:tc>
+          <w:tcPr>
+            <w:tcW w:w="4300" w:type="dxa"/>
+            <w:tcBorders>
+              <w:top w:val="single" w:sz="4" w:space="0" w:color="BFBFBF"/>
+              <w:left w:val="single" w:sz="4" w:space="0" w:color="BFBFBF"/>
+              <w:bottom w:val="single" w:sz="4" w:space="0" w:color="BFBFBF"/>
+              <w:right w:val="single" w:sz="4" w:space="0" w:color="BFBFBF"/>
+            </w:tcBorders>
+            <w:shd w:val="clear" w:color="auto" w:fill="FAFAFA"/>
+            <w:tcMar>
+              <w:top w:w="70" w:type="dxa"/>
+              <w:left w:w="110" w:type="dxa"/>
+              <w:bottom w:w="70" w:type="dxa"/>
+              <w:right w:w="110" w:type="dxa"/>
+            </w:tcMar>
+            <w:vAlign w:val="center"/>
+          </w:tcPr>
+          <w:p>
+            <w:r>
+              <w:rPr>
+                <w:b/>
+                <w:bCs/>
+                <w:sz w:val="19"/>
+                <w:szCs w:val="19"/>
+              </w:rPr>
               <w:t>Bugs found and fixed during verification</w:t>
             </w:r>
           </w:p>
@@ -2891,7 +3067,7 @@
                 <w:sz w:val="19"/>
                 <w:szCs w:val="19"/>
               </w:rPr>
-              <w:t>11</w:t>
+              <w:t>13</w:t>
             </w:r>
           </w:p>
         </w:tc>
@@ -2996,7 +3172,7 @@
                 <w:sz w:val="20"/>
                 <w:szCs w:val="20"/>
               </w:rPr>
-              <w:t>accounts, roles, networks, enrollment, signed agent protocol, telemetry and honest health, topology, incidents, policy-gated actions, audit, onboarding, Go agent, real WireGuard tunnel (lab).</w:t>
+              <w:t>accounts, roles, networks, enrollment, signed agent protocol, telemetry and honest health, topology, incidents, policy-gated actions, audit, onboarding, Go agent, real WireGuard tunnel (lab and userspace over the LAN address), live agent console, device-page actions, Windows service, portal access from the LAN, live Groq diagnosis.</w:t>
             </w:r>
           </w:p>
           <w:p>
@@ -3017,7 +3193,7 @@
                 <w:sz w:val="20"/>
                 <w:szCs w:val="20"/>
               </w:rPr>
-              <w:t>tunnel between two physical PCs; kernel / WireGuardNT interface via the WireGuard app; live Groq diagnosis (needs your API key).</w:t>
+              <w:t>the same userspace tunnel with a second physical PC (steps in docs/two-pc-test.md); kernel / WireGuardNT interface via the WireGuard app.</w:t>
             </w:r>
           </w:p>
           <w:p>
@@ -3049,7 +3225,7 @@
         <w:pStyle w:val="Heading1"/>
         <w:pageBreakBefore/>
       </w:pPr>
-      <w:bookmarkStart w:id="2" w:name="_Toc243225924"/>
+      <w:bookmarkStart w:id="2" w:name="_Toc243468826"/>
       <w:r>
         <w:t>2. Goals and scope</w:t>
       </w:r>
@@ -3167,7 +3343,7 @@
       <w:pPr>
         <w:pStyle w:val="Heading2"/>
       </w:pPr>
-      <w:bookmarkStart w:id="3" w:name="_Toc243225925"/>
+      <w:bookmarkStart w:id="3" w:name="_Toc243468827"/>
       <w:r>
         <w:t>Technology stack</w:t>
       </w:r>
@@ -3369,7 +3545,7 @@
                 <w:sz w:val="19"/>
                 <w:szCs w:val="19"/>
               </w:rPr>
-              <w:t>Operator UI: overview, networks, devices, topology, diagnostics, approvals, audit, onboarding</w:t>
+              <w:t>Operator UI: overview, networks, devices, topology, simulation, diagnostics, approvals, audit, onboarding</w:t>
             </w:r>
           </w:p>
         </w:tc>
@@ -3630,7 +3806,7 @@
                 <w:sz w:val="19"/>
                 <w:szCs w:val="19"/>
               </w:rPr>
-              <w:t>Identity, signed transport, WireGuard inspect/apply, probes, executor, lab</w:t>
+              <w:t>Identity, signed transport, userspace WireGuard tunnel, inspect/apply, probes, executor, event stream, Windows service</w:t>
             </w:r>
           </w:p>
         </w:tc>
@@ -3814,7 +3990,7 @@
         <w:pStyle w:val="Heading1"/>
         <w:pageBreakBefore/>
       </w:pPr>
-      <w:bookmarkStart w:id="4" w:name="_Toc243225926"/>
+      <w:bookmarkStart w:id="4" w:name="_Toc243468828"/>
       <w:r>
         <w:t>3. Architecture</w:t>
       </w:r>
@@ -3831,7 +4007,7 @@
           <w:noProof/>
         </w:rPr>
         <w:drawing>
-          <wp:inline distT="0" distB="0" distL="0" distR="0" wp14:anchorId="67EB67DC" wp14:editId="4CFC42C1">
+          <wp:inline distT="0" distB="0" distL="0" distR="0" wp14:anchorId="1755DEF3" wp14:editId="5456DAE8">
             <wp:extent cx="6096000" cy="2752725"/>
             <wp:effectExtent l="0" t="0" r="0" b="0"/>
             <wp:docPr id="1" name="Figure 1 — Components. The thick lime link is the only path VPN traffic takes." descr="Figure 1 — Components. The thick lime link is the only path VPN traffic takes." title="Figure 1 — Components. The thick lime link is the only path VPN traffic takes."/>
@@ -3890,7 +4066,7 @@
       <w:pPr>
         <w:pStyle w:val="Heading2"/>
       </w:pPr>
-      <w:bookmarkStart w:id="5" w:name="_Toc243225927"/>
+      <w:bookmarkStart w:id="5" w:name="_Toc243468829"/>
       <w:r>
         <w:t>Components</w:t>
       </w:r>
@@ -4526,7 +4702,7 @@
                 <w:sz w:val="19"/>
                 <w:szCs w:val="19"/>
               </w:rPr>
-              <w:t>Enroll, heartbeat, telemetry, probes, approved commands, WireGuard inspect/apply, doctor, export-config, lab</w:t>
+              <w:t>Enroll, heartbeat, telemetry, probes, approved commands, userspace tunnel, WireGuard inspect/apply, event stream, doctor, export-config, lab, Windows service</w:t>
             </w:r>
           </w:p>
         </w:tc>
@@ -4621,7 +4797,7 @@
       <w:pPr>
         <w:pStyle w:val="Heading2"/>
       </w:pPr>
-      <w:bookmarkStart w:id="6" w:name="_Toc243225928"/>
+      <w:bookmarkStart w:id="6" w:name="_Toc243468830"/>
       <w:r>
         <w:t>Five layers of “is it connected?”</w:t>
       </w:r>
@@ -5188,7 +5364,7 @@
       <w:pPr>
         <w:pStyle w:val="Heading2"/>
       </w:pPr>
-      <w:bookmarkStart w:id="7" w:name="_Toc243225929"/>
+      <w:bookmarkStart w:id="7" w:name="_Toc243468831"/>
       <w:r>
         <w:t>Enrollment flow</w:t>
       </w:r>
@@ -5205,7 +5381,7 @@
           <w:noProof/>
         </w:rPr>
         <w:drawing>
-          <wp:inline distT="0" distB="0" distL="0" distR="0" wp14:anchorId="0499CC2B" wp14:editId="1B3A503C">
+          <wp:inline distT="0" distB="0" distL="0" distR="0" wp14:anchorId="2318CCD3" wp14:editId="09768CA1">
             <wp:extent cx="5715000" cy="3638550"/>
             <wp:effectExtent l="0" t="0" r="0" b="0"/>
             <wp:docPr id="2" name="Figure 2 — Enrolling a PC: one-time token, locally generated keys, proof of possession." descr="Figure 2 — Enrolling a PC: one-time token, locally generated keys, proof of possession." title="Figure 2 — Enrolling a PC: one-time token, locally generated keys, proof of possession."/>
@@ -5264,7 +5440,7 @@
       <w:pPr>
         <w:pStyle w:val="Heading2"/>
       </w:pPr>
-      <w:bookmarkStart w:id="8" w:name="_Toc243225930"/>
+      <w:bookmarkStart w:id="8" w:name="_Toc243468832"/>
       <w:r>
         <w:t>Peer link states</w:t>
       </w:r>
@@ -5281,7 +5457,7 @@
           <w:noProof/>
         </w:rPr>
         <w:drawing>
-          <wp:inline distT="0" distB="0" distL="0" distR="0" wp14:anchorId="2724D3A2" wp14:editId="4AD7AC6B">
+          <wp:inline distT="0" distB="0" distL="0" distR="0" wp14:anchorId="23FDA507" wp14:editId="54B0BB48">
             <wp:extent cx="6096000" cy="1381125"/>
             <wp:effectExtent l="0" t="0" r="0" b="0"/>
             <wp:docPr id="3" name="Figure 3 — States the topology draws; “configured” is never shown as a working tunnel." descr="Figure 3 — States the topology draws; “configured” is never shown as a working tunnel." title="Figure 3 — States the topology draws; “configured” is never shown as a working tunnel."/>
@@ -5340,7 +5516,7 @@
       <w:pPr>
         <w:pStyle w:val="Heading2"/>
       </w:pPr>
-      <w:bookmarkStart w:id="9" w:name="_Toc243225931"/>
+      <w:bookmarkStart w:id="9" w:name="_Toc243468833"/>
       <w:r>
         <w:t>Diagnostic loop</w:t>
       </w:r>
@@ -5357,7 +5533,7 @@
           <w:noProof/>
         </w:rPr>
         <w:drawing>
-          <wp:inline distT="0" distB="0" distL="0" distR="0" wp14:anchorId="4EFE520C" wp14:editId="0D9E73A6">
+          <wp:inline distT="0" distB="0" distL="0" distR="0" wp14:anchorId="1B0DACC6" wp14:editId="76A9E5D1">
             <wp:extent cx="2381250" cy="6105525"/>
             <wp:effectExtent l="0" t="0" r="0" b="0"/>
             <wp:docPr id="4" name="Figure 4 — Observe → evidence → plan → validate → policy → human approval → execute → verify." descr="Figure 4 — Observe → evidence → plan → validate → policy → human approval → execute → verify." title="Figure 4 — Observe → evidence → plan → validate → policy → human approval → execute → verify."/>
@@ -5416,7 +5592,7 @@
       <w:pPr>
         <w:pStyle w:val="Heading2"/>
       </w:pPr>
-      <w:bookmarkStart w:id="10" w:name="_Toc243225932"/>
+      <w:bookmarkStart w:id="10" w:name="_Toc243468834"/>
       <w:r>
         <w:t>Data model</w:t>
       </w:r>
@@ -5433,7 +5609,7 @@
           <w:noProof/>
         </w:rPr>
         <w:drawing>
-          <wp:inline distT="0" distB="0" distL="0" distR="0" wp14:anchorId="12C76041" wp14:editId="05C452E4">
+          <wp:inline distT="0" distB="0" distL="0" distR="0" wp14:anchorId="6EE28479" wp14:editId="03011869">
             <wp:extent cx="6096000" cy="3152775"/>
             <wp:effectExtent l="0" t="0" r="0" b="0"/>
             <wp:docPr id="5" name="Figure 5 — Main MongoDB collections and relationships." descr="Figure 5 — Main MongoDB collections and relationships." title="Figure 5 — Main MongoDB collections and relationships."/>
@@ -5493,7 +5669,7 @@
         <w:pStyle w:val="Heading1"/>
         <w:pageBreakBefore/>
       </w:pPr>
-      <w:bookmarkStart w:id="11" w:name="_Toc243225933"/>
+      <w:bookmarkStart w:id="11" w:name="_Toc243468835"/>
       <w:r>
         <w:t>4. What is in the project</w:t>
       </w:r>
@@ -5503,7 +5679,7 @@
       <w:pPr>
         <w:pStyle w:val="Heading2"/>
       </w:pPr>
-      <w:bookmarkStart w:id="12" w:name="_Toc243225934"/>
+      <w:bookmarkStart w:id="12" w:name="_Toc243468836"/>
       <w:r>
         <w:t>4.1 Web console</w:t>
       </w:r>
@@ -5623,10 +5799,70 @@
           <w:b/>
           <w:bCs/>
         </w:rPr>
+        <w:t>Device page</w:t>
+      </w:r>
+      <w:r>
+        <w:t xml:space="preserve"> — live agent console (the agent’s own output, streamed) and buttons to run allowlisted actions on that device: connectivity test, test tunnel to a peer, refresh WireGuard status; each request still needs approval.</w:t>
+      </w:r>
+    </w:p>
+    <w:p>
+      <w:pPr>
+        <w:pStyle w:val="ListParagraph"/>
+        <w:numPr>
+          <w:ilvl w:val="0"/>
+          <w:numId w:val="2"/>
+        </w:numPr>
+        <w:spacing w:after="60"/>
+      </w:pPr>
+      <w:r>
+        <w:rPr>
+          <w:b/>
+          <w:bCs/>
+        </w:rPr>
         <w:t>Topology</w:t>
       </w:r>
       <w:r>
         <w:t xml:space="preserve"> — React Flow graph; solid lime only for links with a fresh handshake.</w:t>
+      </w:r>
+    </w:p>
+    <w:p>
+      <w:pPr>
+        <w:pStyle w:val="ListParagraph"/>
+        <w:numPr>
+          <w:ilvl w:val="0"/>
+          <w:numId w:val="2"/>
+        </w:numPr>
+        <w:spacing w:after="60"/>
+      </w:pPr>
+      <w:r>
+        <w:rPr>
+          <w:b/>
+          <w:bCs/>
+        </w:rPr>
+        <w:t>Simulation</w:t>
+      </w:r>
+      <w:r>
+        <w:t xml:space="preserve"> — animated SVG replay of the two-PC protocol (enrollment, peer config, WireGuard handshake 148 B / 92 B, encrypted probes, telemetry) with five scenarios: normal, 30% loss, peer offline, control plane down, revocation. Packet inspector shows real header fields; every packet is labelled simulated, and the real link state of the selected devices is shown alongside.</w:t>
+      </w:r>
+    </w:p>
+    <w:p>
+      <w:pPr>
+        <w:pStyle w:val="ListParagraph"/>
+        <w:numPr>
+          <w:ilvl w:val="0"/>
+          <w:numId w:val="2"/>
+        </w:numPr>
+        <w:spacing w:after="60"/>
+      </w:pPr>
+      <w:r>
+        <w:rPr>
+          <w:b/>
+          <w:bCs/>
+        </w:rPr>
+        <w:t>Open from another PC</w:t>
+      </w:r>
+      <w:r>
+        <w:t xml:space="preserve"> — the console works from a private-LAN address (e.g. http://192.168.0.105:3000) and serves the Windows agent download, so a second PC needs only a browser.</w:t>
       </w:r>
     </w:p>
     <w:p>
@@ -5673,7 +5909,7 @@
       <w:pPr>
         <w:pStyle w:val="Heading2"/>
       </w:pPr>
-      <w:bookmarkStart w:id="13" w:name="_Toc243225935"/>
+      <w:bookmarkStart w:id="13" w:name="_Toc243468837"/>
       <w:r>
         <w:t>4.2 Control plane</w:t>
       </w:r>
@@ -5759,9 +5995,48 @@
     </w:p>
     <w:p>
       <w:pPr>
+        <w:pStyle w:val="ListParagraph"/>
+        <w:numPr>
+          <w:ilvl w:val="0"/>
+          <w:numId w:val="2"/>
+        </w:numPr>
+        <w:spacing w:after="60"/>
+      </w:pPr>
+      <w:r>
+        <w:t>Agent event stream: signed POST /agent/events, redacted and size-limited, kept for a limited time (TTL index), pushed live to the device page.</w:t>
+      </w:r>
+    </w:p>
+    <w:p>
+      <w:pPr>
+        <w:pStyle w:val="ListParagraph"/>
+        <w:numPr>
+          <w:ilvl w:val="0"/>
+          <w:numId w:val="2"/>
+        </w:numPr>
+        <w:spacing w:after="60"/>
+      </w:pPr>
+      <w:r>
+        <w:t>Device actions without an incident (permission actions:request) go through the same policy engine and approval queue.</w:t>
+      </w:r>
+    </w:p>
+    <w:p>
+      <w:pPr>
+        <w:pStyle w:val="ListParagraph"/>
+        <w:numPr>
+          <w:ilvl w:val="0"/>
+          <w:numId w:val="2"/>
+        </w:numPr>
+        <w:spacing w:after="60"/>
+      </w:pPr>
+      <w:r>
+        <w:t>LAN access: CORS_ALLOW_PRIVATE_LAN accepts console origins on private addresses only (10/8, 172.16/12, 192.168/16), over plain http on a lab network.</w:t>
+      </w:r>
+    </w:p>
+    <w:p>
+      <w:pPr>
         <w:pStyle w:val="Heading2"/>
       </w:pPr>
-      <w:bookmarkStart w:id="14" w:name="_Toc243225936"/>
+      <w:bookmarkStart w:id="14" w:name="_Toc243468838"/>
       <w:r>
         <w:t>4.3 Networking agent (Go)</w:t>
       </w:r>
@@ -5995,6 +6270,124 @@
                 <w:sz w:val="19"/>
                 <w:szCs w:val="19"/>
               </w:rPr>
+              <w:t>run --userspace</w:t>
+            </w:r>
+          </w:p>
+        </w:tc>
+        <w:tc>
+          <w:tcPr>
+            <w:tcW w:w="7038" w:type="dxa"/>
+            <w:tcBorders>
+              <w:top w:val="single" w:sz="4" w:space="0" w:color="BFBFBF"/>
+              <w:left w:val="single" w:sz="4" w:space="0" w:color="BFBFBF"/>
+              <w:bottom w:val="single" w:sz="4" w:space="0" w:color="BFBFBF"/>
+              <w:right w:val="single" w:sz="4" w:space="0" w:color="BFBFBF"/>
+            </w:tcBorders>
+            <w:tcMar>
+              <w:top w:w="70" w:type="dxa"/>
+              <w:left w:w="110" w:type="dxa"/>
+              <w:bottom w:w="70" w:type="dxa"/>
+              <w:right w:w="110" w:type="dxa"/>
+            </w:tcMar>
+            <w:vAlign w:val="center"/>
+          </w:tcPr>
+          <w:p>
+            <w:r>
+              <w:rPr>
+                <w:sz w:val="19"/>
+                <w:szCs w:val="19"/>
+              </w:rPr>
+              <w:t>Same, plus its own WireGuard tunnel (wireguard-go + in-process network stack): peers synced from the control plane, probes through the tunnel; no WireGuard app, no Administrator</w:t>
+            </w:r>
+          </w:p>
+        </w:tc>
+      </w:tr>
+      <w:tr>
+        <w:tc>
+          <w:tcPr>
+            <w:tcW w:w="2600" w:type="dxa"/>
+            <w:tcBorders>
+              <w:top w:val="single" w:sz="4" w:space="0" w:color="BFBFBF"/>
+              <w:left w:val="single" w:sz="4" w:space="0" w:color="BFBFBF"/>
+              <w:bottom w:val="single" w:sz="4" w:space="0" w:color="BFBFBF"/>
+              <w:right w:val="single" w:sz="4" w:space="0" w:color="BFBFBF"/>
+            </w:tcBorders>
+            <w:shd w:val="clear" w:color="auto" w:fill="FAFAFA"/>
+            <w:tcMar>
+              <w:top w:w="70" w:type="dxa"/>
+              <w:left w:w="110" w:type="dxa"/>
+              <w:bottom w:w="70" w:type="dxa"/>
+              <w:right w:w="110" w:type="dxa"/>
+            </w:tcMar>
+            <w:vAlign w:val="center"/>
+          </w:tcPr>
+          <w:p>
+            <w:r>
+              <w:rPr>
+                <w:b/>
+                <w:bCs/>
+                <w:sz w:val="19"/>
+                <w:szCs w:val="19"/>
+              </w:rPr>
+              <w:t>install / uninstall / service-status</w:t>
+            </w:r>
+          </w:p>
+        </w:tc>
+        <w:tc>
+          <w:tcPr>
+            <w:tcW w:w="7038" w:type="dxa"/>
+            <w:tcBorders>
+              <w:top w:val="single" w:sz="4" w:space="0" w:color="BFBFBF"/>
+              <w:left w:val="single" w:sz="4" w:space="0" w:color="BFBFBF"/>
+              <w:bottom w:val="single" w:sz="4" w:space="0" w:color="BFBFBF"/>
+              <w:right w:val="single" w:sz="4" w:space="0" w:color="BFBFBF"/>
+            </w:tcBorders>
+            <w:shd w:val="clear" w:color="auto" w:fill="FAFAFA"/>
+            <w:tcMar>
+              <w:top w:w="70" w:type="dxa"/>
+              <w:left w:w="110" w:type="dxa"/>
+              <w:bottom w:w="70" w:type="dxa"/>
+              <w:right w:w="110" w:type="dxa"/>
+            </w:tcMar>
+            <w:vAlign w:val="center"/>
+          </w:tcPr>
+          <w:p>
+            <w:r>
+              <w:rPr>
+                <w:sz w:val="19"/>
+                <w:szCs w:val="19"/>
+              </w:rPr>
+              <w:t>Windows service “NexLink Agent”: starts with the PC, restarts on failure, logs to agent.log; output still reaches the agent console</w:t>
+            </w:r>
+          </w:p>
+        </w:tc>
+      </w:tr>
+      <w:tr>
+        <w:tc>
+          <w:tcPr>
+            <w:tcW w:w="2600" w:type="dxa"/>
+            <w:tcBorders>
+              <w:top w:val="single" w:sz="4" w:space="0" w:color="BFBFBF"/>
+              <w:left w:val="single" w:sz="4" w:space="0" w:color="BFBFBF"/>
+              <w:bottom w:val="single" w:sz="4" w:space="0" w:color="BFBFBF"/>
+              <w:right w:val="single" w:sz="4" w:space="0" w:color="BFBFBF"/>
+            </w:tcBorders>
+            <w:tcMar>
+              <w:top w:w="70" w:type="dxa"/>
+              <w:left w:w="110" w:type="dxa"/>
+              <w:bottom w:w="70" w:type="dxa"/>
+              <w:right w:w="110" w:type="dxa"/>
+            </w:tcMar>
+            <w:vAlign w:val="center"/>
+          </w:tcPr>
+          <w:p>
+            <w:r>
+              <w:rPr>
+                <w:b/>
+                <w:bCs/>
+                <w:sz w:val="19"/>
+                <w:szCs w:val="19"/>
+              </w:rPr>
               <w:t>status / doctor</w:t>
             </w:r>
           </w:p>
@@ -6210,7 +6603,7 @@
       <w:pPr>
         <w:pStyle w:val="Heading2"/>
       </w:pPr>
-      <w:bookmarkStart w:id="15" w:name="_Toc243225937"/>
+      <w:bookmarkStart w:id="15" w:name="_Toc243468839"/>
       <w:r>
         <w:t>4.4 Diagnostic service (Python)</w:t>
       </w:r>
@@ -6260,7 +6653,7 @@
         <w:pStyle w:val="Heading1"/>
         <w:pageBreakBefore/>
       </w:pPr>
-      <w:bookmarkStart w:id="16" w:name="_Toc243225938"/>
+      <w:bookmarkStart w:id="16" w:name="_Toc243468840"/>
       <w:r>
         <w:t>5. Status matrix</w:t>
       </w:r>
@@ -7338,7 +7731,7 @@
                 <w:sz w:val="19"/>
                 <w:szCs w:val="19"/>
               </w:rPr>
-              <w:t>20 Go tests + integration test</w:t>
+              <w:t>23 Go tests + integration test</w:t>
             </w:r>
           </w:p>
         </w:tc>
@@ -7367,7 +7760,7 @@
                 <w:sz w:val="19"/>
                 <w:szCs w:val="19"/>
               </w:rPr>
-              <w:t>Real WireGuard tunnel, two agents (lab)</w:t>
+              <w:t>Agent console, device actions, Windows service</w:t>
             </w:r>
           </w:p>
         </w:tc>
@@ -7424,7 +7817,7 @@
                 <w:sz w:val="19"/>
                 <w:szCs w:val="19"/>
               </w:rPr>
-              <w:t>nexlink-agent lab runs; approved test 0.23 ms / 0% loss</w:t>
+              <w:t>device-console.test.js, events_test.go, service --debug run</w:t>
             </w:r>
           </w:p>
         </w:tc>
@@ -7453,7 +7846,7 @@
                 <w:sz w:val="19"/>
                 <w:szCs w:val="19"/>
               </w:rPr>
-              <w:t>export-config, doctor, LAN endpoint ranking</w:t>
+              <w:t>Protocol simulation page (5 scenarios)</w:t>
             </w:r>
           </w:p>
         </w:tc>
@@ -7466,7 +7859,7 @@
               <w:bottom w:val="single" w:sz="4" w:space="0" w:color="BFBFBF"/>
               <w:right w:val="single" w:sz="4" w:space="0" w:color="BFBFBF"/>
             </w:tcBorders>
-            <w:shd w:val="clear" w:color="auto" w:fill="FFF2C2"/>
+            <w:shd w:val="clear" w:color="auto" w:fill="E8FFB8"/>
             <w:tcMar>
               <w:top w:w="70" w:type="dxa"/>
               <w:left w:w="110" w:type="dxa"/>
@@ -7483,7 +7876,7 @@
                 <w:sz w:val="19"/>
                 <w:szCs w:val="19"/>
               </w:rPr>
-              <w:t>Partially verified</w:t>
+              <w:t>Done &amp; tested</w:t>
             </w:r>
           </w:p>
         </w:tc>
@@ -7510,7 +7903,7 @@
                 <w:sz w:val="19"/>
                 <w:szCs w:val="19"/>
               </w:rPr>
-              <w:t>Two agents on one PC; not yet on two PCs</w:t>
+              <w:t>Browser check of every scenario; timelines end in the expected link state</w:t>
             </w:r>
           </w:p>
         </w:tc>
@@ -7539,7 +7932,7 @@
                 <w:sz w:val="19"/>
                 <w:szCs w:val="19"/>
               </w:rPr>
-              <w:t>Groq LLM diagnosis</w:t>
+              <w:t>Portal from another PC on the LAN</w:t>
             </w:r>
           </w:p>
         </w:tc>
@@ -7552,7 +7945,7 @@
               <w:bottom w:val="single" w:sz="4" w:space="0" w:color="BFBFBF"/>
               <w:right w:val="single" w:sz="4" w:space="0" w:color="BFBFBF"/>
             </w:tcBorders>
-            <w:shd w:val="clear" w:color="auto" w:fill="FFF2C2"/>
+            <w:shd w:val="clear" w:color="auto" w:fill="E8FFB8"/>
             <w:tcMar>
               <w:top w:w="70" w:type="dxa"/>
               <w:left w:w="110" w:type="dxa"/>
@@ -7569,7 +7962,7 @@
                 <w:sz w:val="19"/>
                 <w:szCs w:val="19"/>
               </w:rPr>
-              <w:t>Partially verified</w:t>
+              <w:t>Done &amp; tested</w:t>
             </w:r>
           </w:p>
         </w:tc>
@@ -7596,7 +7989,7 @@
                 <w:sz w:val="19"/>
                 <w:szCs w:val="19"/>
               </w:rPr>
-              <w:t>15 tests with mocked Groq; live call needs key</w:t>
+              <w:t>config.test.js + browser check via 192.168.0.105</w:t>
             </w:r>
           </w:p>
         </w:tc>
@@ -7625,7 +8018,7 @@
                 <w:sz w:val="19"/>
                 <w:szCs w:val="19"/>
               </w:rPr>
-              <w:t>Kernel / WireGuardNT interface (WireGuard app)</w:t>
+              <w:t>Userspace tunnel over the LAN address (two agent processes)</w:t>
             </w:r>
           </w:p>
         </w:tc>
@@ -7638,7 +8031,7 @@
               <w:bottom w:val="single" w:sz="4" w:space="0" w:color="BFBFBF"/>
               <w:right w:val="single" w:sz="4" w:space="0" w:color="BFBFBF"/>
             </w:tcBorders>
-            <w:shd w:val="clear" w:color="auto" w:fill="E6E6E6"/>
+            <w:shd w:val="clear" w:color="auto" w:fill="E8FFB8"/>
             <w:tcMar>
               <w:top w:w="70" w:type="dxa"/>
               <w:left w:w="110" w:type="dxa"/>
@@ -7655,7 +8048,7 @@
                 <w:sz w:val="19"/>
                 <w:szCs w:val="19"/>
               </w:rPr>
-              <w:t>Ready, manual run pending</w:t>
+              <w:t>Done &amp; tested</w:t>
             </w:r>
           </w:p>
         </w:tc>
@@ -7682,7 +8075,7 @@
                 <w:sz w:val="19"/>
                 <w:szCs w:val="19"/>
               </w:rPr>
-              <w:t>Needs WireGuard app + Administrator</w:t>
+              <w:t>Handshake; probes 0.3–2.9 ms; connected · direct</w:t>
             </w:r>
           </w:p>
         </w:tc>
@@ -7711,7 +8104,7 @@
                 <w:sz w:val="19"/>
                 <w:szCs w:val="19"/>
               </w:rPr>
-              <w:t>Tunnel between two physical PCs</w:t>
+              <w:t>Real WireGuard tunnel, two agents (lab)</w:t>
             </w:r>
           </w:p>
         </w:tc>
@@ -7724,7 +8117,7 @@
               <w:bottom w:val="single" w:sz="4" w:space="0" w:color="BFBFBF"/>
               <w:right w:val="single" w:sz="4" w:space="0" w:color="BFBFBF"/>
             </w:tcBorders>
-            <w:shd w:val="clear" w:color="auto" w:fill="E6E6E6"/>
+            <w:shd w:val="clear" w:color="auto" w:fill="E8FFB8"/>
             <w:tcMar>
               <w:top w:w="70" w:type="dxa"/>
               <w:left w:w="110" w:type="dxa"/>
@@ -7741,6 +8134,264 @@
                 <w:sz w:val="19"/>
                 <w:szCs w:val="19"/>
               </w:rPr>
+              <w:t>Done &amp; tested</w:t>
+            </w:r>
+          </w:p>
+        </w:tc>
+        <w:tc>
+          <w:tcPr>
+            <w:tcW w:w="3438" w:type="dxa"/>
+            <w:tcBorders>
+              <w:top w:val="single" w:sz="4" w:space="0" w:color="BFBFBF"/>
+              <w:left w:val="single" w:sz="4" w:space="0" w:color="BFBFBF"/>
+              <w:bottom w:val="single" w:sz="4" w:space="0" w:color="BFBFBF"/>
+              <w:right w:val="single" w:sz="4" w:space="0" w:color="BFBFBF"/>
+            </w:tcBorders>
+            <w:tcMar>
+              <w:top w:w="70" w:type="dxa"/>
+              <w:left w:w="110" w:type="dxa"/>
+              <w:bottom w:w="70" w:type="dxa"/>
+              <w:right w:w="110" w:type="dxa"/>
+            </w:tcMar>
+            <w:vAlign w:val="center"/>
+          </w:tcPr>
+          <w:p>
+            <w:r>
+              <w:rPr>
+                <w:sz w:val="19"/>
+                <w:szCs w:val="19"/>
+              </w:rPr>
+              <w:t>nexlink-agent lab runs; approved test 0.23 ms / 0% loss</w:t>
+            </w:r>
+          </w:p>
+        </w:tc>
+      </w:tr>
+      <w:tr>
+        <w:tc>
+          <w:tcPr>
+            <w:tcW w:w="4300" w:type="dxa"/>
+            <w:tcBorders>
+              <w:top w:val="single" w:sz="4" w:space="0" w:color="BFBFBF"/>
+              <w:left w:val="single" w:sz="4" w:space="0" w:color="BFBFBF"/>
+              <w:bottom w:val="single" w:sz="4" w:space="0" w:color="BFBFBF"/>
+              <w:right w:val="single" w:sz="4" w:space="0" w:color="BFBFBF"/>
+            </w:tcBorders>
+            <w:tcMar>
+              <w:top w:w="70" w:type="dxa"/>
+              <w:left w:w="110" w:type="dxa"/>
+              <w:bottom w:w="70" w:type="dxa"/>
+              <w:right w:w="110" w:type="dxa"/>
+            </w:tcMar>
+            <w:vAlign w:val="center"/>
+          </w:tcPr>
+          <w:p>
+            <w:r>
+              <w:rPr>
+                <w:sz w:val="19"/>
+                <w:szCs w:val="19"/>
+              </w:rPr>
+              <w:t>export-config, doctor, LAN endpoint ranking</w:t>
+            </w:r>
+          </w:p>
+        </w:tc>
+        <w:tc>
+          <w:tcPr>
+            <w:tcW w:w="1900" w:type="dxa"/>
+            <w:tcBorders>
+              <w:top w:val="single" w:sz="4" w:space="0" w:color="BFBFBF"/>
+              <w:left w:val="single" w:sz="4" w:space="0" w:color="BFBFBF"/>
+              <w:bottom w:val="single" w:sz="4" w:space="0" w:color="BFBFBF"/>
+              <w:right w:val="single" w:sz="4" w:space="0" w:color="BFBFBF"/>
+            </w:tcBorders>
+            <w:shd w:val="clear" w:color="auto" w:fill="FFF2C2"/>
+            <w:tcMar>
+              <w:top w:w="70" w:type="dxa"/>
+              <w:left w:w="110" w:type="dxa"/>
+              <w:bottom w:w="70" w:type="dxa"/>
+              <w:right w:w="110" w:type="dxa"/>
+            </w:tcMar>
+            <w:vAlign w:val="center"/>
+          </w:tcPr>
+          <w:p>
+            <w:r>
+              <w:rPr>
+                <w:b/>
+                <w:bCs/>
+                <w:sz w:val="19"/>
+                <w:szCs w:val="19"/>
+              </w:rPr>
+              <w:t>Partially verified</w:t>
+            </w:r>
+          </w:p>
+        </w:tc>
+        <w:tc>
+          <w:tcPr>
+            <w:tcW w:w="3438" w:type="dxa"/>
+            <w:tcBorders>
+              <w:top w:val="single" w:sz="4" w:space="0" w:color="BFBFBF"/>
+              <w:left w:val="single" w:sz="4" w:space="0" w:color="BFBFBF"/>
+              <w:bottom w:val="single" w:sz="4" w:space="0" w:color="BFBFBF"/>
+              <w:right w:val="single" w:sz="4" w:space="0" w:color="BFBFBF"/>
+            </w:tcBorders>
+            <w:tcMar>
+              <w:top w:w="70" w:type="dxa"/>
+              <w:left w:w="110" w:type="dxa"/>
+              <w:bottom w:w="70" w:type="dxa"/>
+              <w:right w:w="110" w:type="dxa"/>
+            </w:tcMar>
+            <w:vAlign w:val="center"/>
+          </w:tcPr>
+          <w:p>
+            <w:r>
+              <w:rPr>
+                <w:sz w:val="19"/>
+                <w:szCs w:val="19"/>
+              </w:rPr>
+              <w:t>Two agents on one PC; not yet on two physical PCs</w:t>
+            </w:r>
+          </w:p>
+        </w:tc>
+      </w:tr>
+      <w:tr>
+        <w:tc>
+          <w:tcPr>
+            <w:tcW w:w="4300" w:type="dxa"/>
+            <w:tcBorders>
+              <w:top w:val="single" w:sz="4" w:space="0" w:color="BFBFBF"/>
+              <w:left w:val="single" w:sz="4" w:space="0" w:color="BFBFBF"/>
+              <w:bottom w:val="single" w:sz="4" w:space="0" w:color="BFBFBF"/>
+              <w:right w:val="single" w:sz="4" w:space="0" w:color="BFBFBF"/>
+            </w:tcBorders>
+            <w:tcMar>
+              <w:top w:w="70" w:type="dxa"/>
+              <w:left w:w="110" w:type="dxa"/>
+              <w:bottom w:w="70" w:type="dxa"/>
+              <w:right w:w="110" w:type="dxa"/>
+            </w:tcMar>
+            <w:vAlign w:val="center"/>
+          </w:tcPr>
+          <w:p>
+            <w:r>
+              <w:rPr>
+                <w:sz w:val="19"/>
+                <w:szCs w:val="19"/>
+              </w:rPr>
+              <w:t>Groq LLM diagnosis</w:t>
+            </w:r>
+          </w:p>
+        </w:tc>
+        <w:tc>
+          <w:tcPr>
+            <w:tcW w:w="1900" w:type="dxa"/>
+            <w:tcBorders>
+              <w:top w:val="single" w:sz="4" w:space="0" w:color="BFBFBF"/>
+              <w:left w:val="single" w:sz="4" w:space="0" w:color="BFBFBF"/>
+              <w:bottom w:val="single" w:sz="4" w:space="0" w:color="BFBFBF"/>
+              <w:right w:val="single" w:sz="4" w:space="0" w:color="BFBFBF"/>
+            </w:tcBorders>
+            <w:shd w:val="clear" w:color="auto" w:fill="E8FFB8"/>
+            <w:tcMar>
+              <w:top w:w="70" w:type="dxa"/>
+              <w:left w:w="110" w:type="dxa"/>
+              <w:bottom w:w="70" w:type="dxa"/>
+              <w:right w:w="110" w:type="dxa"/>
+            </w:tcMar>
+            <w:vAlign w:val="center"/>
+          </w:tcPr>
+          <w:p>
+            <w:r>
+              <w:rPr>
+                <w:b/>
+                <w:bCs/>
+                <w:sz w:val="19"/>
+                <w:szCs w:val="19"/>
+              </w:rPr>
+              <w:t>Done &amp; tested</w:t>
+            </w:r>
+          </w:p>
+        </w:tc>
+        <w:tc>
+          <w:tcPr>
+            <w:tcW w:w="3438" w:type="dxa"/>
+            <w:tcBorders>
+              <w:top w:val="single" w:sz="4" w:space="0" w:color="BFBFBF"/>
+              <w:left w:val="single" w:sz="4" w:space="0" w:color="BFBFBF"/>
+              <w:bottom w:val="single" w:sz="4" w:space="0" w:color="BFBFBF"/>
+              <w:right w:val="single" w:sz="4" w:space="0" w:color="BFBFBF"/>
+            </w:tcBorders>
+            <w:tcMar>
+              <w:top w:w="70" w:type="dxa"/>
+              <w:left w:w="110" w:type="dxa"/>
+              <w:bottom w:w="70" w:type="dxa"/>
+              <w:right w:w="110" w:type="dxa"/>
+            </w:tcMar>
+            <w:vAlign w:val="center"/>
+          </w:tcPr>
+          <w:p>
+            <w:r>
+              <w:rPr>
+                <w:sz w:val="19"/>
+                <w:szCs w:val="19"/>
+              </w:rPr>
+              <w:t>15 tests with mocked Groq + live diagnosis with openai/gpt-oss-120b</w:t>
+            </w:r>
+          </w:p>
+        </w:tc>
+      </w:tr>
+      <w:tr>
+        <w:tc>
+          <w:tcPr>
+            <w:tcW w:w="4300" w:type="dxa"/>
+            <w:tcBorders>
+              <w:top w:val="single" w:sz="4" w:space="0" w:color="BFBFBF"/>
+              <w:left w:val="single" w:sz="4" w:space="0" w:color="BFBFBF"/>
+              <w:bottom w:val="single" w:sz="4" w:space="0" w:color="BFBFBF"/>
+              <w:right w:val="single" w:sz="4" w:space="0" w:color="BFBFBF"/>
+            </w:tcBorders>
+            <w:tcMar>
+              <w:top w:w="70" w:type="dxa"/>
+              <w:left w:w="110" w:type="dxa"/>
+              <w:bottom w:w="70" w:type="dxa"/>
+              <w:right w:w="110" w:type="dxa"/>
+            </w:tcMar>
+            <w:vAlign w:val="center"/>
+          </w:tcPr>
+          <w:p>
+            <w:r>
+              <w:rPr>
+                <w:sz w:val="19"/>
+                <w:szCs w:val="19"/>
+              </w:rPr>
+              <w:t>Kernel / WireGuardNT interface (WireGuard app)</w:t>
+            </w:r>
+          </w:p>
+        </w:tc>
+        <w:tc>
+          <w:tcPr>
+            <w:tcW w:w="1900" w:type="dxa"/>
+            <w:tcBorders>
+              <w:top w:val="single" w:sz="4" w:space="0" w:color="BFBFBF"/>
+              <w:left w:val="single" w:sz="4" w:space="0" w:color="BFBFBF"/>
+              <w:bottom w:val="single" w:sz="4" w:space="0" w:color="BFBFBF"/>
+              <w:right w:val="single" w:sz="4" w:space="0" w:color="BFBFBF"/>
+            </w:tcBorders>
+            <w:shd w:val="clear" w:color="auto" w:fill="E6E6E6"/>
+            <w:tcMar>
+              <w:top w:w="70" w:type="dxa"/>
+              <w:left w:w="110" w:type="dxa"/>
+              <w:bottom w:w="70" w:type="dxa"/>
+              <w:right w:w="110" w:type="dxa"/>
+            </w:tcMar>
+            <w:vAlign w:val="center"/>
+          </w:tcPr>
+          <w:p>
+            <w:r>
+              <w:rPr>
+                <w:b/>
+                <w:bCs/>
+                <w:sz w:val="19"/>
+                <w:szCs w:val="19"/>
+              </w:rPr>
               <w:t>Ready, manual run pending</w:t>
             </w:r>
           </w:p>
@@ -7768,7 +8419,93 @@
                 <w:sz w:val="19"/>
                 <w:szCs w:val="19"/>
               </w:rPr>
-              <w:t>Runbook docs/two-pc-test.md</w:t>
+              <w:t>Needs WireGuard app + Administrator</w:t>
+            </w:r>
+          </w:p>
+        </w:tc>
+      </w:tr>
+      <w:tr>
+        <w:tc>
+          <w:tcPr>
+            <w:tcW w:w="4300" w:type="dxa"/>
+            <w:tcBorders>
+              <w:top w:val="single" w:sz="4" w:space="0" w:color="BFBFBF"/>
+              <w:left w:val="single" w:sz="4" w:space="0" w:color="BFBFBF"/>
+              <w:bottom w:val="single" w:sz="4" w:space="0" w:color="BFBFBF"/>
+              <w:right w:val="single" w:sz="4" w:space="0" w:color="BFBFBF"/>
+            </w:tcBorders>
+            <w:tcMar>
+              <w:top w:w="70" w:type="dxa"/>
+              <w:left w:w="110" w:type="dxa"/>
+              <w:bottom w:w="70" w:type="dxa"/>
+              <w:right w:w="110" w:type="dxa"/>
+            </w:tcMar>
+            <w:vAlign w:val="center"/>
+          </w:tcPr>
+          <w:p>
+            <w:r>
+              <w:rPr>
+                <w:sz w:val="19"/>
+                <w:szCs w:val="19"/>
+              </w:rPr>
+              <w:t>Tunnel between two physical PCs</w:t>
+            </w:r>
+          </w:p>
+        </w:tc>
+        <w:tc>
+          <w:tcPr>
+            <w:tcW w:w="1900" w:type="dxa"/>
+            <w:tcBorders>
+              <w:top w:val="single" w:sz="4" w:space="0" w:color="BFBFBF"/>
+              <w:left w:val="single" w:sz="4" w:space="0" w:color="BFBFBF"/>
+              <w:bottom w:val="single" w:sz="4" w:space="0" w:color="BFBFBF"/>
+              <w:right w:val="single" w:sz="4" w:space="0" w:color="BFBFBF"/>
+            </w:tcBorders>
+            <w:shd w:val="clear" w:color="auto" w:fill="E6E6E6"/>
+            <w:tcMar>
+              <w:top w:w="70" w:type="dxa"/>
+              <w:left w:w="110" w:type="dxa"/>
+              <w:bottom w:w="70" w:type="dxa"/>
+              <w:right w:w="110" w:type="dxa"/>
+            </w:tcMar>
+            <w:vAlign w:val="center"/>
+          </w:tcPr>
+          <w:p>
+            <w:r>
+              <w:rPr>
+                <w:b/>
+                <w:bCs/>
+                <w:sz w:val="19"/>
+                <w:szCs w:val="19"/>
+              </w:rPr>
+              <w:t>Ready, manual run pending</w:t>
+            </w:r>
+          </w:p>
+        </w:tc>
+        <w:tc>
+          <w:tcPr>
+            <w:tcW w:w="3438" w:type="dxa"/>
+            <w:tcBorders>
+              <w:top w:val="single" w:sz="4" w:space="0" w:color="BFBFBF"/>
+              <w:left w:val="single" w:sz="4" w:space="0" w:color="BFBFBF"/>
+              <w:bottom w:val="single" w:sz="4" w:space="0" w:color="BFBFBF"/>
+              <w:right w:val="single" w:sz="4" w:space="0" w:color="BFBFBF"/>
+            </w:tcBorders>
+            <w:tcMar>
+              <w:top w:w="70" w:type="dxa"/>
+              <w:left w:w="110" w:type="dxa"/>
+              <w:bottom w:w="70" w:type="dxa"/>
+              <w:right w:w="110" w:type="dxa"/>
+            </w:tcMar>
+            <w:vAlign w:val="center"/>
+          </w:tcPr>
+          <w:p>
+            <w:r>
+              <w:rPr>
+                <w:sz w:val="19"/>
+                <w:szCs w:val="19"/>
+              </w:rPr>
+              <w:t>Same userspace path, second PC needed — docs/two-pc-test.md</w:t>
             </w:r>
           </w:p>
         </w:tc>
@@ -7951,7 +8688,7 @@
         <w:pStyle w:val="Heading1"/>
         <w:pageBreakBefore/>
       </w:pPr>
-      <w:bookmarkStart w:id="17" w:name="_Toc243225939"/>
+      <w:bookmarkStart w:id="17" w:name="_Toc243468841"/>
       <w:r>
         <w:t>6. Verification results</w:t>
       </w:r>
@@ -7961,7 +8698,7 @@
       <w:pPr>
         <w:pStyle w:val="Heading2"/>
       </w:pPr>
-      <w:bookmarkStart w:id="18" w:name="_Toc243225940"/>
+      <w:bookmarkStart w:id="18" w:name="_Toc243468842"/>
       <w:r>
         <w:t>6.1 Automated tests</w:t>
       </w:r>
@@ -8196,7 +8933,7 @@
                 <w:sz w:val="19"/>
                 <w:szCs w:val="19"/>
               </w:rPr>
-              <w:t>59 / 59</w:t>
+              <w:t>64 / 64</w:t>
             </w:r>
           </w:p>
         </w:tc>
@@ -8309,7 +9046,7 @@
                 <w:sz w:val="19"/>
                 <w:szCs w:val="19"/>
               </w:rPr>
-              <w:t>20 / 20</w:t>
+              <w:t>23 / 23</w:t>
             </w:r>
           </w:p>
         </w:tc>
@@ -8676,6 +9413,119 @@
                 <w:szCs w:val="19"/>
               </w:rPr>
               <w:t>12 routes</w:t>
+            </w:r>
+          </w:p>
+        </w:tc>
+      </w:tr>
+      <w:tr>
+        <w:tc>
+          <w:tcPr>
+            <w:tcW w:w="2300" w:type="dxa"/>
+            <w:tcBorders>
+              <w:top w:val="single" w:sz="4" w:space="0" w:color="BFBFBF"/>
+              <w:left w:val="single" w:sz="4" w:space="0" w:color="BFBFBF"/>
+              <w:bottom w:val="single" w:sz="4" w:space="0" w:color="BFBFBF"/>
+              <w:right w:val="single" w:sz="4" w:space="0" w:color="BFBFBF"/>
+            </w:tcBorders>
+            <w:tcMar>
+              <w:top w:w="70" w:type="dxa"/>
+              <w:left w:w="110" w:type="dxa"/>
+              <w:bottom w:w="70" w:type="dxa"/>
+              <w:right w:w="110" w:type="dxa"/>
+            </w:tcMar>
+            <w:vAlign w:val="center"/>
+          </w:tcPr>
+          <w:p>
+            <w:r>
+              <w:rPr>
+                <w:sz w:val="19"/>
+                <w:szCs w:val="19"/>
+              </w:rPr>
+              <w:t>Userspace tunnel over the LAN</w:t>
+            </w:r>
+          </w:p>
+        </w:tc>
+        <w:tc>
+          <w:tcPr>
+            <w:tcW w:w="3500" w:type="dxa"/>
+            <w:tcBorders>
+              <w:top w:val="single" w:sz="4" w:space="0" w:color="BFBFBF"/>
+              <w:left w:val="single" w:sz="4" w:space="0" w:color="BFBFBF"/>
+              <w:bottom w:val="single" w:sz="4" w:space="0" w:color="BFBFBF"/>
+              <w:right w:val="single" w:sz="4" w:space="0" w:color="BFBFBF"/>
+            </w:tcBorders>
+            <w:tcMar>
+              <w:top w:w="70" w:type="dxa"/>
+              <w:left w:w="110" w:type="dxa"/>
+              <w:bottom w:w="70" w:type="dxa"/>
+              <w:right w:w="110" w:type="dxa"/>
+            </w:tcMar>
+            <w:vAlign w:val="center"/>
+          </w:tcPr>
+          <w:p>
+            <w:r>
+              <w:rPr>
+                <w:sz w:val="19"/>
+                <w:szCs w:val="19"/>
+              </w:rPr>
+              <w:t>run --userspace (two processes)</w:t>
+            </w:r>
+          </w:p>
+        </w:tc>
+        <w:tc>
+          <w:tcPr>
+            <w:tcW w:w="1500" w:type="dxa"/>
+            <w:tcBorders>
+              <w:top w:val="single" w:sz="4" w:space="0" w:color="BFBFBF"/>
+              <w:left w:val="single" w:sz="4" w:space="0" w:color="BFBFBF"/>
+              <w:bottom w:val="single" w:sz="4" w:space="0" w:color="BFBFBF"/>
+              <w:right w:val="single" w:sz="4" w:space="0" w:color="BFBFBF"/>
+            </w:tcBorders>
+            <w:shd w:val="clear" w:color="auto" w:fill="E8FFB8"/>
+            <w:tcMar>
+              <w:top w:w="70" w:type="dxa"/>
+              <w:left w:w="110" w:type="dxa"/>
+              <w:bottom w:w="70" w:type="dxa"/>
+              <w:right w:w="110" w:type="dxa"/>
+            </w:tcMar>
+            <w:vAlign w:val="center"/>
+          </w:tcPr>
+          <w:p>
+            <w:r>
+              <w:rPr>
+                <w:b/>
+                <w:bCs/>
+                <w:sz w:val="19"/>
+                <w:szCs w:val="19"/>
+              </w:rPr>
+              <w:t>Connected</w:t>
+            </w:r>
+          </w:p>
+        </w:tc>
+        <w:tc>
+          <w:tcPr>
+            <w:tcW w:w="2338" w:type="dxa"/>
+            <w:tcBorders>
+              <w:top w:val="single" w:sz="4" w:space="0" w:color="BFBFBF"/>
+              <w:left w:val="single" w:sz="4" w:space="0" w:color="BFBFBF"/>
+              <w:bottom w:val="single" w:sz="4" w:space="0" w:color="BFBFBF"/>
+              <w:right w:val="single" w:sz="4" w:space="0" w:color="BFBFBF"/>
+            </w:tcBorders>
+            <w:tcMar>
+              <w:top w:w="70" w:type="dxa"/>
+              <w:left w:w="110" w:type="dxa"/>
+              <w:bottom w:w="70" w:type="dxa"/>
+              <w:right w:w="110" w:type="dxa"/>
+            </w:tcMar>
+            <w:vAlign w:val="center"/>
+          </w:tcPr>
+          <w:p>
+            <w:r>
+              <w:rPr>
+                <w:sz w:val="19"/>
+                <w:szCs w:val="19"/>
+              </w:rPr>
+              <w:t>Real WireGuard over the LAN address, one machine</w:t>
             </w:r>
           </w:p>
         </w:tc>
@@ -8798,7 +9648,7 @@
       <w:pPr>
         <w:pStyle w:val="Heading2"/>
       </w:pPr>
-      <w:bookmarkStart w:id="19" w:name="_Toc243225941"/>
+      <w:bookmarkStart w:id="19" w:name="_Toc243468843"/>
       <w:r>
         <w:t>6.2 Real WireGuard tunnel (lab)</w:t>
       </w:r>
@@ -9320,7 +10170,7 @@
           <w:noProof/>
         </w:rPr>
         <w:drawing>
-          <wp:inline distT="0" distB="0" distL="0" distR="0" wp14:anchorId="57ACADEC" wp14:editId="16992050">
+          <wp:inline distT="0" distB="0" distL="0" distR="0" wp14:anchorId="5C1230C3" wp14:editId="40E580A9">
             <wp:extent cx="5334000" cy="3590925"/>
             <wp:effectExtent l="0" t="0" r="0" b="0"/>
             <wp:docPr id="6" name="Figure 6 — Topology during the lab run: the pc-a ⇄ pc-b edge is verified by a handshake." descr="Figure 6 — Topology during the lab run: the pc-a ⇄ pc-b edge is verified by a handshake." title="Figure 6 — Topology during the lab run: the pc-a ⇄ pc-b edge is verified by a handshake."/>
@@ -9386,7 +10236,7 @@
           <w:noProof/>
         </w:rPr>
         <w:drawing>
-          <wp:inline distT="0" distB="0" distL="0" distR="0" wp14:anchorId="0B794DEB" wp14:editId="47AEF455">
+          <wp:inline distT="0" distB="0" distL="0" distR="0" wp14:anchorId="3F859961" wp14:editId="0359EABE">
             <wp:extent cx="5334000" cy="3629025"/>
             <wp:effectExtent l="0" t="0" r="0" b="0"/>
             <wp:docPr id="7" name="Figure 7 — Approved connectivity test executed through the tunnel and verified as successful." descr="Figure 7 — Approved connectivity test executed through the tunnel and verified as successful." title="Figure 7 — Approved connectivity test executed through the tunnel and verified as successful."/>
@@ -9498,7 +10348,7 @@
                 <w:sz w:val="20"/>
                 <w:szCs w:val="20"/>
               </w:rPr>
-              <w:t>It proves the full path enrollment → desired config → handshake → telemetry → policy-gated action → verification with the real WireGuard protocol. It does not yet prove connectivity across two physical machines, a real LAN, or NAT; that is the pending two-PC test.</w:t>
+              <w:t>It proves the full path enrollment → desired config → handshake → telemetry → policy-gated action → verification with the real WireGuard protocol. A second run with run --userspace used two separate agent processes talking over the PC’s LAN address (192.168.0.105, UDP 51820 and 51821): handshake established, probes 0.3–2.9 ms both ways, topology connected · direct. It does not yet prove connectivity across two physical machines or NAT; that is the pending two-PC test.</w:t>
             </w:r>
           </w:p>
         </w:tc>
@@ -9508,7 +10358,7 @@
       <w:pPr>
         <w:pStyle w:val="Heading2"/>
       </w:pPr>
-      <w:bookmarkStart w:id="20" w:name="_Toc243225942"/>
+      <w:bookmarkStart w:id="20" w:name="_Toc243468844"/>
       <w:r>
         <w:t>6.3 Browser checks</w:t>
       </w:r>
@@ -9576,14 +10426,40 @@
         <w:spacing w:after="60"/>
       </w:pPr>
       <w:r>
-        <w:t>“Ask AI” round trip through the diagnostic service (mock provider), output labelled as mock.</w:t>
+        <w:t>“Ask AI” round trip through the diagnostic service — mock provider (labelled mock) and live Groq (openai/gpt-oss-120b).</w:t>
+      </w:r>
+    </w:p>
+    <w:p>
+      <w:pPr>
+        <w:pStyle w:val="ListParagraph"/>
+        <w:numPr>
+          <w:ilvl w:val="0"/>
+          <w:numId w:val="2"/>
+        </w:numPr>
+        <w:spacing w:after="60"/>
+      </w:pPr>
+      <w:r>
+        <w:t>Device page: agent console streaming live; test tunnel → approve → verified result; refresh status from a button.</w:t>
+      </w:r>
+    </w:p>
+    <w:p>
+      <w:pPr>
+        <w:pStyle w:val="ListParagraph"/>
+        <w:numPr>
+          <w:ilvl w:val="0"/>
+          <w:numId w:val="2"/>
+        </w:numPr>
+        <w:spacing w:after="60"/>
+      </w:pPr>
+      <w:r>
+        <w:t>Console opened through the LAN address: sign-in, API, agent download and live socket all answer.</w:t>
       </w:r>
     </w:p>
     <w:p>
       <w:pPr>
         <w:pStyle w:val="Heading2"/>
       </w:pPr>
-      <w:bookmarkStart w:id="21" w:name="_Toc243225943"/>
+      <w:bookmarkStart w:id="21" w:name="_Toc243468845"/>
       <w:r>
         <w:t>6.4 Bugs found and fixed during verification</w:t>
       </w:r>
@@ -10289,6 +11165,124 @@
                 <w:sz w:val="19"/>
                 <w:szCs w:val="19"/>
               </w:rPr>
+              <w:t>Groq model in the default config was not available for the key</w:t>
+            </w:r>
+          </w:p>
+        </w:tc>
+        <w:tc>
+          <w:tcPr>
+            <w:tcW w:w="6038" w:type="dxa"/>
+            <w:tcBorders>
+              <w:top w:val="single" w:sz="4" w:space="0" w:color="BFBFBF"/>
+              <w:left w:val="single" w:sz="4" w:space="0" w:color="BFBFBF"/>
+              <w:bottom w:val="single" w:sz="4" w:space="0" w:color="BFBFBF"/>
+              <w:right w:val="single" w:sz="4" w:space="0" w:color="BFBFBF"/>
+            </w:tcBorders>
+            <w:tcMar>
+              <w:top w:w="70" w:type="dxa"/>
+              <w:left w:w="110" w:type="dxa"/>
+              <w:bottom w:w="70" w:type="dxa"/>
+              <w:right w:w="110" w:type="dxa"/>
+            </w:tcMar>
+            <w:vAlign w:val="center"/>
+          </w:tcPr>
+          <w:p>
+            <w:r>
+              <w:rPr>
+                <w:sz w:val="19"/>
+                <w:szCs w:val="19"/>
+              </w:rPr>
+              <w:t>Default switched to openai/gpt-oss-120b with JSON mode</w:t>
+            </w:r>
+          </w:p>
+        </w:tc>
+      </w:tr>
+      <w:tr>
+        <w:tc>
+          <w:tcPr>
+            <w:tcW w:w="3600" w:type="dxa"/>
+            <w:tcBorders>
+              <w:top w:val="single" w:sz="4" w:space="0" w:color="BFBFBF"/>
+              <w:left w:val="single" w:sz="4" w:space="0" w:color="BFBFBF"/>
+              <w:bottom w:val="single" w:sz="4" w:space="0" w:color="BFBFBF"/>
+              <w:right w:val="single" w:sz="4" w:space="0" w:color="BFBFBF"/>
+            </w:tcBorders>
+            <w:shd w:val="clear" w:color="auto" w:fill="FAFAFA"/>
+            <w:tcMar>
+              <w:top w:w="70" w:type="dxa"/>
+              <w:left w:w="110" w:type="dxa"/>
+              <w:bottom w:w="70" w:type="dxa"/>
+              <w:right w:w="110" w:type="dxa"/>
+            </w:tcMar>
+            <w:vAlign w:val="center"/>
+          </w:tcPr>
+          <w:p>
+            <w:r>
+              <w:rPr>
+                <w:b/>
+                <w:bCs/>
+                <w:sz w:val="19"/>
+                <w:szCs w:val="19"/>
+              </w:rPr>
+              <w:t>Python tests picked up the real .env and called Groq</w:t>
+            </w:r>
+          </w:p>
+        </w:tc>
+        <w:tc>
+          <w:tcPr>
+            <w:tcW w:w="6038" w:type="dxa"/>
+            <w:tcBorders>
+              <w:top w:val="single" w:sz="4" w:space="0" w:color="BFBFBF"/>
+              <w:left w:val="single" w:sz="4" w:space="0" w:color="BFBFBF"/>
+              <w:bottom w:val="single" w:sz="4" w:space="0" w:color="BFBFBF"/>
+              <w:right w:val="single" w:sz="4" w:space="0" w:color="BFBFBF"/>
+            </w:tcBorders>
+            <w:shd w:val="clear" w:color="auto" w:fill="FAFAFA"/>
+            <w:tcMar>
+              <w:top w:w="70" w:type="dxa"/>
+              <w:left w:w="110" w:type="dxa"/>
+              <w:bottom w:w="70" w:type="dxa"/>
+              <w:right w:w="110" w:type="dxa"/>
+            </w:tcMar>
+            <w:vAlign w:val="center"/>
+          </w:tcPr>
+          <w:p>
+            <w:r>
+              <w:rPr>
+                <w:sz w:val="19"/>
+                <w:szCs w:val="19"/>
+              </w:rPr>
+              <w:t>Test fixture forces the mock provider and an empty key</w:t>
+            </w:r>
+          </w:p>
+        </w:tc>
+      </w:tr>
+      <w:tr>
+        <w:tc>
+          <w:tcPr>
+            <w:tcW w:w="3600" w:type="dxa"/>
+            <w:tcBorders>
+              <w:top w:val="single" w:sz="4" w:space="0" w:color="BFBFBF"/>
+              <w:left w:val="single" w:sz="4" w:space="0" w:color="BFBFBF"/>
+              <w:bottom w:val="single" w:sz="4" w:space="0" w:color="BFBFBF"/>
+              <w:right w:val="single" w:sz="4" w:space="0" w:color="BFBFBF"/>
+            </w:tcBorders>
+            <w:tcMar>
+              <w:top w:w="70" w:type="dxa"/>
+              <w:left w:w="110" w:type="dxa"/>
+              <w:bottom w:w="70" w:type="dxa"/>
+              <w:right w:w="110" w:type="dxa"/>
+            </w:tcMar>
+            <w:vAlign w:val="center"/>
+          </w:tcPr>
+          <w:p>
+            <w:r>
+              <w:rPr>
+                <w:b/>
+                <w:bCs/>
+                <w:sz w:val="19"/>
+                <w:szCs w:val="19"/>
+              </w:rPr>
               <w:t>Test command did not find test files on Node 22</w:t>
             </w:r>
           </w:p>
@@ -10327,7 +11321,7 @@
         <w:pStyle w:val="Heading1"/>
         <w:pageBreakBefore/>
       </w:pPr>
-      <w:bookmarkStart w:id="22" w:name="_Toc243225944"/>
+      <w:bookmarkStart w:id="22" w:name="_Toc243468846"/>
       <w:r>
         <w:t>7. Security model</w:t>
       </w:r>
@@ -10442,7 +11436,7 @@
         <w:pStyle w:val="Heading1"/>
         <w:pageBreakBefore/>
       </w:pPr>
-      <w:bookmarkStart w:id="23" w:name="_Toc243225945"/>
+      <w:bookmarkStart w:id="23" w:name="_Toc243468847"/>
       <w:r>
         <w:t>8. What is not in the project yet</w:t>
       </w:r>
@@ -10645,7 +11639,7 @@
                 <w:sz w:val="19"/>
                 <w:szCs w:val="19"/>
               </w:rPr>
-              <w:t>Second PC, WireGuard app, firewall rules — follow docs/two-pc-test.md</w:t>
+              <w:t>Second PC on the same Wi-Fi: browser, agent download, run --userspace — follow docs/two-pc-test.md</w:t>
             </w:r>
           </w:p>
         </w:tc>
@@ -10732,92 +11726,6 @@
                 <w:szCs w:val="19"/>
               </w:rPr>
               <w:t>Install WireGuard for Windows; import export-config output; run agent as Administrator</w:t>
-            </w:r>
-          </w:p>
-        </w:tc>
-      </w:tr>
-      <w:tr>
-        <w:tc>
-          <w:tcPr>
-            <w:tcW w:w="3000" w:type="dxa"/>
-            <w:tcBorders>
-              <w:top w:val="single" w:sz="4" w:space="0" w:color="BFBFBF"/>
-              <w:left w:val="single" w:sz="4" w:space="0" w:color="BFBFBF"/>
-              <w:bottom w:val="single" w:sz="4" w:space="0" w:color="BFBFBF"/>
-              <w:right w:val="single" w:sz="4" w:space="0" w:color="BFBFBF"/>
-            </w:tcBorders>
-            <w:tcMar>
-              <w:top w:w="70" w:type="dxa"/>
-              <w:left w:w="110" w:type="dxa"/>
-              <w:bottom w:w="70" w:type="dxa"/>
-              <w:right w:w="110" w:type="dxa"/>
-            </w:tcMar>
-            <w:vAlign w:val="center"/>
-          </w:tcPr>
-          <w:p>
-            <w:r>
-              <w:rPr>
-                <w:sz w:val="19"/>
-                <w:szCs w:val="19"/>
-              </w:rPr>
-              <w:t>Live Groq diagnosis</w:t>
-            </w:r>
-          </w:p>
-        </w:tc>
-        <w:tc>
-          <w:tcPr>
-            <w:tcW w:w="1700" w:type="dxa"/>
-            <w:tcBorders>
-              <w:top w:val="single" w:sz="4" w:space="0" w:color="BFBFBF"/>
-              <w:left w:val="single" w:sz="4" w:space="0" w:color="BFBFBF"/>
-              <w:bottom w:val="single" w:sz="4" w:space="0" w:color="BFBFBF"/>
-              <w:right w:val="single" w:sz="4" w:space="0" w:color="BFBFBF"/>
-            </w:tcBorders>
-            <w:shd w:val="clear" w:color="auto" w:fill="E6E6E6"/>
-            <w:tcMar>
-              <w:top w:w="70" w:type="dxa"/>
-              <w:left w:w="110" w:type="dxa"/>
-              <w:bottom w:w="70" w:type="dxa"/>
-              <w:right w:w="110" w:type="dxa"/>
-            </w:tcMar>
-            <w:vAlign w:val="center"/>
-          </w:tcPr>
-          <w:p>
-            <w:r>
-              <w:rPr>
-                <w:b/>
-                <w:bCs/>
-                <w:sz w:val="19"/>
-                <w:szCs w:val="19"/>
-              </w:rPr>
-              <w:t>Ready, manual run pending</w:t>
-            </w:r>
-          </w:p>
-        </w:tc>
-        <w:tc>
-          <w:tcPr>
-            <w:tcW w:w="4938" w:type="dxa"/>
-            <w:tcBorders>
-              <w:top w:val="single" w:sz="4" w:space="0" w:color="BFBFBF"/>
-              <w:left w:val="single" w:sz="4" w:space="0" w:color="BFBFBF"/>
-              <w:bottom w:val="single" w:sz="4" w:space="0" w:color="BFBFBF"/>
-              <w:right w:val="single" w:sz="4" w:space="0" w:color="BFBFBF"/>
-            </w:tcBorders>
-            <w:tcMar>
-              <w:top w:w="70" w:type="dxa"/>
-              <w:left w:w="110" w:type="dxa"/>
-              <w:bottom w:w="70" w:type="dxa"/>
-              <w:right w:w="110" w:type="dxa"/>
-            </w:tcMar>
-            <w:vAlign w:val="center"/>
-          </w:tcPr>
-          <w:p>
-            <w:r>
-              <w:rPr>
-                <w:sz w:val="19"/>
-                <w:szCs w:val="19"/>
-              </w:rPr>
-              <w:t>Set GROQ_API_KEY and NEXLINK_DIAG_PROVIDER=groq; review output quality</w:t>
             </w:r>
           </w:p>
         </w:tc>
@@ -11429,7 +12337,7 @@
       <w:pPr>
         <w:pStyle w:val="Heading2"/>
       </w:pPr>
-      <w:bookmarkStart w:id="24" w:name="_Toc243225946"/>
+      <w:bookmarkStart w:id="24" w:name="_Toc243468848"/>
       <w:r>
         <w:t>Known limitations and environment notes</w:t>
       </w:r>
@@ -11484,7 +12392,20 @@
         <w:spacing w:after="60"/>
       </w:pPr>
       <w:r>
-        <w:t>The test network used for verification contains two offline test devices, which is why lab devices show “degraded” (1 of 3 peers connected).</w:t>
+        <w:t>The userspace tunnel (run --userspace) carries NexLink traffic — handshakes, probes and approved tests — not other applications; a system-wide VPN adapter uses the WireGuard app path.</w:t>
+      </w:r>
+    </w:p>
+    <w:p>
+      <w:pPr>
+        <w:pStyle w:val="ListParagraph"/>
+        <w:numPr>
+          <w:ilvl w:val="0"/>
+          <w:numId w:val="2"/>
+        </w:numPr>
+        <w:spacing w:after="60"/>
+      </w:pPr>
+      <w:r>
+        <w:t>Installing the Windows service and opening firewall ports (scripts/lan-firewall.ps1) need Administrator; enrolling and running the userspace agent do not.</w:t>
       </w:r>
     </w:p>
     <w:p>
@@ -11492,7 +12413,7 @@
         <w:pStyle w:val="Heading1"/>
         <w:pageBreakBefore/>
       </w:pPr>
-      <w:bookmarkStart w:id="25" w:name="_Toc243225947"/>
+      <w:bookmarkStart w:id="25" w:name="_Toc243468849"/>
       <w:r>
         <w:t>9. How to run</w:t>
       </w:r>
@@ -11654,6 +12575,53 @@
         <w:pStyle w:val="Heading3"/>
       </w:pPr>
       <w:r>
+        <w:t>Second PC on the same Wi-Fi (no admin on PC-2)</w:t>
+      </w:r>
+    </w:p>
+    <w:p>
+      <w:pPr>
+        <w:spacing w:after="120" w:line="276" w:lineRule="auto"/>
+      </w:pPr>
+      <w:r>
+        <w:t>Once on PC-1 (Administrator): scripts\lan-firewall.ps1 -Server -Agent. On PC-2 open http://&lt;PC-1 LAN IP&gt;:3000, sign in with the same account, register this pc, download the agent, then:</w:t>
+      </w:r>
+    </w:p>
+    <w:p>
+      <w:pPr>
+        <w:shd w:val="clear" w:color="auto" w:fill="F3F3F3"/>
+      </w:pPr>
+      <w:r>
+        <w:rPr>
+          <w:rFonts w:ascii="Consolas" w:eastAsia="Consolas" w:hAnsi="Consolas" w:cs="Consolas"/>
+          <w:sz w:val="18"/>
+          <w:szCs w:val="18"/>
+        </w:rPr>
+        <w:t>.\nexlink-agent.exe enroll --server http://&lt;PC-1 LAN IP&gt;:4000 --allow-http</w:t>
+      </w:r>
+    </w:p>
+    <w:p>
+      <w:pPr>
+        <w:shd w:val="clear" w:color="auto" w:fill="F3F3F3"/>
+      </w:pPr>
+      <w:r>
+        <w:rPr>
+          <w:rFonts w:ascii="Consolas" w:eastAsia="Consolas" w:hAnsi="Consolas" w:cs="Consolas"/>
+          <w:sz w:val="18"/>
+          <w:szCs w:val="18"/>
+        </w:rPr>
+        <w:t>.\nexlink-agent.exe run --userspace --allow-http</w:t>
+      </w:r>
+    </w:p>
+    <w:p>
+      <w:pPr>
+        <w:spacing w:after="60"/>
+      </w:pPr>
+    </w:p>
+    <w:p>
+      <w:pPr>
+        <w:pStyle w:val="Heading3"/>
+      </w:pPr>
+      <w:r>
         <w:t>Tests</w:t>
       </w:r>
     </w:p>
@@ -11705,7 +12673,7 @@
       <w:pPr>
         <w:pStyle w:val="Heading2"/>
       </w:pPr>
-      <w:bookmarkStart w:id="26" w:name="_Toc243225948"/>
+      <w:bookmarkStart w:id="26" w:name="_Toc243468850"/>
       <w:r>
         <w:t>Roadmap</w:t>
       </w:r>
@@ -11721,20 +12689,7 @@
         <w:spacing w:after="60"/>
       </w:pPr>
       <w:r>
-        <w:t>Run the two-PC tunnel test with the WireGuard app (docs/two-pc-test.md).</w:t>
-      </w:r>
-    </w:p>
-    <w:p>
-      <w:pPr>
-        <w:pStyle w:val="ListParagraph"/>
-        <w:numPr>
-          <w:ilvl w:val="0"/>
-          <w:numId w:val="3"/>
-        </w:numPr>
-        <w:spacing w:after="60"/>
-      </w:pPr>
-      <w:r>
-        <w:t>Run a live Groq diagnosis and review its quality.</w:t>
+        <w:t>Run the two-PC tunnel test with a second physical PC (docs/two-pc-test.md).</w:t>
       </w:r>
     </w:p>
     <w:p>
@@ -11768,7 +12723,7 @@
         <w:pStyle w:val="Heading1"/>
         <w:pageBreakBefore/>
       </w:pPr>
-      <w:bookmarkStart w:id="27" w:name="_Toc243225949"/>
+      <w:bookmarkStart w:id="27" w:name="_Toc243468851"/>
       <w:r>
         <w:t>Appendix A — Repository layout</w:t>
       </w:r>
@@ -12217,7 +13172,7 @@
       <w:pPr>
         <w:pStyle w:val="Heading2"/>
       </w:pPr>
-      <w:bookmarkStart w:id="28" w:name="_Toc243225950"/>
+      <w:bookmarkStart w:id="28" w:name="_Toc243468852"/>
       <w:r>
         <w:t>Appendix B — Documentation index</w:t>
       </w:r>
@@ -12769,7 +13724,7 @@
         <w:sz w:val="16"/>
         <w:szCs w:val="16"/>
       </w:rPr>
-      <w:t>18 October 2026</w:t>
+      <w:t>19 October 2026</w:t>
     </w:r>
     <w:r>
       <w:rPr>
@@ -12865,10 +13820,10 @@
 <file path=word/numbering.xml><?xml version="1.0" encoding="utf-8"?>
 <w:numbering xmlns:wpc="http://schemas.microsoft.com/office/word/2010/wordprocessingCanvas" xmlns:cx="http://schemas.microsoft.com/office/drawing/2014/chartex" xmlns:cx1="http://schemas.microsoft.com/office/drawing/2015/9/8/chartex" xmlns:cx2="http://schemas.microsoft.com/office/drawing/2015/10/21/chartex" xmlns:cx3="http://schemas.microsoft.com/office/drawing/2016/5/9/chartex" xmlns:cx4="http://schemas.microsoft.com/office/drawing/2016/5/10/chartex" xmlns:cx5="http://schemas.microsoft.com/office/drawing/2016/5/11/chartex" xmlns:cx6="http://schemas.microsoft.com/office/drawing/2016/5/12/chartex" xmlns:cx7="http://schemas.microsoft.com/office/drawing/2016/5/13/chartex" xmlns:cx8="http://schemas.microsoft.com/office/drawing/2016/5/14/chartex" xmlns:mc="http://schemas.openxmlformats.org/markup-compatibility/2006" xmlns:aink="http://schemas.microsoft.com/office/drawing/2016/ink" xmlns:am3d="http://schemas.microsoft.com/office/drawing/2017/model3d" xmlns:o="urn:schemas-microsoft-com:office:office" xmlns:oel="http://schemas.microsoft.com/office/2019/extlst" xmlns:r="http://schemas.openxmlformats.org/officeDocument/2006/relationships" xmlns:m="http://schemas.openxmlformats.org/officeDocument/2006/math" xmlns:v="urn:schemas-microsoft-com:vml" xmlns:wp14="http://schemas.microsoft.com/office/word/2010/wordprocessingDrawing" xmlns:wp="http://schemas.openxmlformats.org/drawingml/2006/wordprocessingDrawing" xmlns:w10="urn:schemas-microsoft-com:office:word" xmlns:w="http://schemas.openxmlformats.org/wordprocessingml/2006/main" xmlns:w14="http://schemas.microsoft.com/office/word/2010/wordml" xmlns:w15="http://schemas.microsoft.com/office/word/2012/wordml" xmlns:w16cex="http://schemas.microsoft.com/office/word/2018/wordml/cex" xmlns:w16cid="http://schemas.microsoft.com/office/word/2016/wordml/cid" xmlns:w16="http://schemas.microsoft.com/office/word/2018/wordml" xmlns:w16du="http://schemas.microsoft.com/office/word/2023/wordml/word16du" xmlns:w16sdtdh="http://schemas.microsoft.com/office/word/2020/wordml/sdtdatahash" xmlns:w16sdtfl="http://schemas.microsoft.com/office/word/2024/wordml/sdtformatlock" xmlns:w16se="http://schemas.microsoft.com/office/word/2015/wordml/symex" xmlns:wpg="http://schemas.microsoft.com/office/word/2010/wordprocessingGroup" xmlns:wpi="http://schemas.microsoft.com/office/word/2010/wordprocessingInk" xmlns:wne="http://schemas.microsoft.com/office/word/2006/wordml" xmlns:wps="http://schemas.microsoft.com/office/word/2010/wordprocessingShape" mc:Ignorable="w14 w15 w16se w16cid w16 w16cex w16sdtdh w16sdtfl w16du wp14">
   <w:abstractNum w:abstractNumId="0" w15:restartNumberingAfterBreak="0">
-    <w:nsid w:val="17AE33AE"/>
+    <w:nsid w:val="1FFA7F16"/>
     <w:multiLevelType w:val="hybridMultilevel"/>
-    <w:tmpl w:val="94FE5CCA"/>
-    <w:lvl w:ilvl="0" w:tplc="2A7C268C">
+    <w:tmpl w:val="95F69332"/>
+    <w:lvl w:ilvl="0" w:tplc="6ABE87F2">
       <w:start w:val="1"/>
       <w:numFmt w:val="decimal"/>
       <w:lvlText w:val="%1."/>
@@ -12877,52 +13832,52 @@
         <w:ind w:left="540" w:hanging="300"/>
       </w:pPr>
     </w:lvl>
-    <w:lvl w:ilvl="1" w:tplc="147E7BEA">
+    <w:lvl w:ilvl="1" w:tplc="BD5AB0EA">
       <w:numFmt w:val="decimal"/>
       <w:lvlText w:val=""/>
       <w:lvlJc w:val="left"/>
     </w:lvl>
-    <w:lvl w:ilvl="2" w:tplc="502C06C0">
+    <w:lvl w:ilvl="2" w:tplc="7DC0A296">
       <w:numFmt w:val="decimal"/>
       <w:lvlText w:val=""/>
       <w:lvlJc w:val="left"/>
     </w:lvl>
-    <w:lvl w:ilvl="3" w:tplc="40CC1E8A">
+    <w:lvl w:ilvl="3" w:tplc="CF965658">
       <w:numFmt w:val="decimal"/>
       <w:lvlText w:val=""/>
       <w:lvlJc w:val="left"/>
     </w:lvl>
-    <w:lvl w:ilvl="4" w:tplc="EF9CE69E">
+    <w:lvl w:ilvl="4" w:tplc="D54E9AC0">
       <w:numFmt w:val="decimal"/>
       <w:lvlText w:val=""/>
       <w:lvlJc w:val="left"/>
     </w:lvl>
-    <w:lvl w:ilvl="5" w:tplc="BF940FDE">
+    <w:lvl w:ilvl="5" w:tplc="4566AD42">
       <w:numFmt w:val="decimal"/>
       <w:lvlText w:val=""/>
       <w:lvlJc w:val="left"/>
     </w:lvl>
-    <w:lvl w:ilvl="6" w:tplc="0A6C4238">
+    <w:lvl w:ilvl="6" w:tplc="32BA5A68">
       <w:numFmt w:val="decimal"/>
       <w:lvlText w:val=""/>
       <w:lvlJc w:val="left"/>
     </w:lvl>
-    <w:lvl w:ilvl="7" w:tplc="E1F4E6E4">
+    <w:lvl w:ilvl="7" w:tplc="A09AA1BA">
       <w:numFmt w:val="decimal"/>
       <w:lvlText w:val=""/>
       <w:lvlJc w:val="left"/>
     </w:lvl>
-    <w:lvl w:ilvl="8" w:tplc="6E1CB626">
+    <w:lvl w:ilvl="8" w:tplc="D8A48470">
       <w:numFmt w:val="decimal"/>
       <w:lvlText w:val=""/>
       <w:lvlJc w:val="left"/>
     </w:lvl>
   </w:abstractNum>
   <w:abstractNum w:abstractNumId="1" w15:restartNumberingAfterBreak="0">
-    <w:nsid w:val="209D5F8A"/>
+    <w:nsid w:val="481D37F8"/>
     <w:multiLevelType w:val="hybridMultilevel"/>
-    <w:tmpl w:val="16B47B72"/>
-    <w:lvl w:ilvl="0" w:tplc="2D741680">
+    <w:tmpl w:val="B0D8DFC0"/>
+    <w:lvl w:ilvl="0" w:tplc="420AD6DC">
       <w:start w:val="1"/>
       <w:numFmt w:val="bullet"/>
       <w:lvlText w:val="•"/>
@@ -12931,52 +13886,52 @@
         <w:ind w:left="540" w:hanging="270"/>
       </w:pPr>
     </w:lvl>
-    <w:lvl w:ilvl="1" w:tplc="A86CE1FA">
+    <w:lvl w:ilvl="1" w:tplc="4FA4A9BC">
       <w:numFmt w:val="decimal"/>
       <w:lvlText w:val=""/>
       <w:lvlJc w:val="left"/>
     </w:lvl>
-    <w:lvl w:ilvl="2" w:tplc="C1AA1BCC">
+    <w:lvl w:ilvl="2" w:tplc="189C72E6">
       <w:numFmt w:val="decimal"/>
       <w:lvlText w:val=""/>
       <w:lvlJc w:val="left"/>
     </w:lvl>
-    <w:lvl w:ilvl="3" w:tplc="AEEE9308">
+    <w:lvl w:ilvl="3" w:tplc="7402E2E4">
       <w:numFmt w:val="decimal"/>
       <w:lvlText w:val=""/>
       <w:lvlJc w:val="left"/>
     </w:lvl>
-    <w:lvl w:ilvl="4" w:tplc="34F86D2E">
+    <w:lvl w:ilvl="4" w:tplc="D2D83956">
       <w:numFmt w:val="decimal"/>
       <w:lvlText w:val=""/>
       <w:lvlJc w:val="left"/>
     </w:lvl>
-    <w:lvl w:ilvl="5" w:tplc="02B42450">
+    <w:lvl w:ilvl="5" w:tplc="FA2AC776">
       <w:numFmt w:val="decimal"/>
       <w:lvlText w:val=""/>
       <w:lvlJc w:val="left"/>
     </w:lvl>
-    <w:lvl w:ilvl="6" w:tplc="5F3E678A">
+    <w:lvl w:ilvl="6" w:tplc="7E169BAA">
       <w:numFmt w:val="decimal"/>
       <w:lvlText w:val=""/>
       <w:lvlJc w:val="left"/>
     </w:lvl>
-    <w:lvl w:ilvl="7" w:tplc="8A1E17F2">
+    <w:lvl w:ilvl="7" w:tplc="5F302BAA">
       <w:numFmt w:val="decimal"/>
       <w:lvlText w:val=""/>
       <w:lvlJc w:val="left"/>
     </w:lvl>
-    <w:lvl w:ilvl="8" w:tplc="22B49B0A">
+    <w:lvl w:ilvl="8" w:tplc="A53436EC">
       <w:numFmt w:val="decimal"/>
       <w:lvlText w:val=""/>
       <w:lvlJc w:val="left"/>
     </w:lvl>
   </w:abstractNum>
   <w:abstractNum w:abstractNumId="2" w15:restartNumberingAfterBreak="0">
-    <w:nsid w:val="6BE16131"/>
+    <w:nsid w:val="587C572E"/>
     <w:multiLevelType w:val="hybridMultilevel"/>
-    <w:tmpl w:val="6FDCD36C"/>
-    <w:lvl w:ilvl="0" w:tplc="75EA2B16" w:tentative="1">
+    <w:tmpl w:val="6FA0E3D2"/>
+    <w:lvl w:ilvl="0" w:tplc="A8C662F2" w:tentative="1">
       <w:start w:val="1"/>
       <w:numFmt w:val="bullet"/>
       <w:lvlText w:val="●"/>
@@ -12985,7 +13940,7 @@
         <w:ind w:left="720" w:hanging="360"/>
       </w:pPr>
     </w:lvl>
-    <w:lvl w:ilvl="1" w:tplc="4A2E4412" w:tentative="1">
+    <w:lvl w:ilvl="1" w:tplc="66DA50B6" w:tentative="1">
       <w:start w:val="1"/>
       <w:numFmt w:val="bullet"/>
       <w:lvlText w:val="○"/>
@@ -12994,7 +13949,7 @@
         <w:ind w:left="1440" w:hanging="360"/>
       </w:pPr>
     </w:lvl>
-    <w:lvl w:ilvl="2" w:tplc="E9620DBE" w:tentative="1">
+    <w:lvl w:ilvl="2" w:tplc="DE261A9C" w:tentative="1">
       <w:start w:val="1"/>
       <w:numFmt w:val="bullet"/>
       <w:lvlText w:val="■"/>
@@ -13003,7 +13958,7 @@
         <w:ind w:left="2160" w:hanging="360"/>
       </w:pPr>
     </w:lvl>
-    <w:lvl w:ilvl="3" w:tplc="B2003CA8" w:tentative="1">
+    <w:lvl w:ilvl="3" w:tplc="5A12DC82" w:tentative="1">
       <w:start w:val="1"/>
       <w:numFmt w:val="bullet"/>
       <w:lvlText w:val="●"/>
@@ -13012,7 +13967,7 @@
         <w:ind w:left="2880" w:hanging="360"/>
       </w:pPr>
     </w:lvl>
-    <w:lvl w:ilvl="4" w:tplc="7D4EA4CC" w:tentative="1">
+    <w:lvl w:ilvl="4" w:tplc="F760A806" w:tentative="1">
       <w:start w:val="1"/>
       <w:numFmt w:val="bullet"/>
       <w:lvlText w:val="○"/>
@@ -13021,7 +13976,7 @@
         <w:ind w:left="3600" w:hanging="360"/>
       </w:pPr>
     </w:lvl>
-    <w:lvl w:ilvl="5" w:tplc="D98441D8" w:tentative="1">
+    <w:lvl w:ilvl="5" w:tplc="8FB6B73C" w:tentative="1">
       <w:start w:val="1"/>
       <w:numFmt w:val="bullet"/>
       <w:lvlText w:val="■"/>
@@ -13030,7 +13985,7 @@
         <w:ind w:left="4320" w:hanging="360"/>
       </w:pPr>
     </w:lvl>
-    <w:lvl w:ilvl="6" w:tplc="7534EBA6" w:tentative="1">
+    <w:lvl w:ilvl="6" w:tplc="1506CDD2" w:tentative="1">
       <w:start w:val="1"/>
       <w:numFmt w:val="bullet"/>
       <w:lvlText w:val="●"/>
@@ -13039,7 +13994,7 @@
         <w:ind w:left="5040" w:hanging="360"/>
       </w:pPr>
     </w:lvl>
-    <w:lvl w:ilvl="7" w:tplc="FF12EDDA" w:tentative="1">
+    <w:lvl w:ilvl="7" w:tplc="89949032" w:tentative="1">
       <w:start w:val="1"/>
       <w:numFmt w:val="bullet"/>
       <w:lvlText w:val="●"/>
@@ -13048,7 +14003,7 @@
         <w:ind w:left="5760" w:hanging="360"/>
       </w:pPr>
     </w:lvl>
-    <w:lvl w:ilvl="8" w:tplc="8B50E13E" w:tentative="1">
+    <w:lvl w:ilvl="8" w:tplc="4F640E62" w:tentative="1">
       <w:start w:val="1"/>
       <w:numFmt w:val="bullet"/>
       <w:lvlText w:val="●"/>
@@ -13058,19 +14013,19 @@
       </w:pPr>
     </w:lvl>
   </w:abstractNum>
-  <w:num w:numId="1" w16cid:durableId="1983608625">
+  <w:num w:numId="1" w16cid:durableId="1171869758">
     <w:abstractNumId w:val="2"/>
     <w:lvlOverride w:ilvl="0">
       <w:startOverride w:val="1"/>
     </w:lvlOverride>
   </w:num>
-  <w:num w:numId="2" w16cid:durableId="1043141328">
+  <w:num w:numId="2" w16cid:durableId="264843728">
     <w:abstractNumId w:val="1"/>
     <w:lvlOverride w:ilvl="0">
       <w:startOverride w:val="1"/>
     </w:lvlOverride>
   </w:num>
-  <w:num w:numId="3" w16cid:durableId="1894349822">
+  <w:num w:numId="3" w16cid:durableId="1505821707">
     <w:abstractNumId w:val="0"/>
     <w:lvlOverride w:ilvl="0">
       <w:startOverride w:val="1"/>
@@ -13722,7 +14677,7 @@
     <w:autoRedefine/>
     <w:uiPriority w:val="39"/>
     <w:unhideWhenUsed/>
-    <w:rsid w:val="004273F1"/>
+    <w:rsid w:val="00A60127"/>
     <w:pPr>
       <w:spacing w:after="100"/>
     </w:pPr>
@@ -13734,7 +14689,7 @@
     <w:autoRedefine/>
     <w:uiPriority w:val="39"/>
     <w:unhideWhenUsed/>
-    <w:rsid w:val="004273F1"/>
+    <w:rsid w:val="00A60127"/>
     <w:pPr>
       <w:spacing w:after="100"/>
       <w:ind w:left="210"/>

</xml_diff>